<commit_message>
fix bugs, improve UI
</commit_message>
<xml_diff>
--- a/Disertatie.docx
+++ b/Disertatie.docx
@@ -472,8 +472,6 @@
         </w:rPr>
         <w:t>y zones to enhance data control, using a custom redundancy procedure.</w:t>
       </w:r>
-      <w:bookmarkStart w:id="0" w:name="_GoBack"/>
-      <w:bookmarkEnd w:id="0"/>
     </w:p>
     <w:p>
       <w:pPr>
@@ -2916,7 +2914,7 @@
             <w:noProof/>
             <w:webHidden/>
           </w:rPr>
-          <w:t>30</w:t>
+          <w:t>31</w:t>
         </w:r>
         <w:r>
           <w:rPr>
@@ -3116,6 +3114,8 @@
         </w:rPr>
         <w:fldChar w:fldCharType="end"/>
       </w:r>
+      <w:bookmarkStart w:id="0" w:name="_GoBack"/>
+      <w:bookmarkEnd w:id="0"/>
     </w:p>
     <w:p>
       <w:pPr>
@@ -9344,24 +9344,14 @@
       <w:pPr>
         <w:pStyle w:val="Stil1"/>
         <w:keepNext/>
-      </w:pPr>
-      <w:r>
-        <w:rPr>
-          <w:rFonts w:eastAsiaTheme="majorEastAsia"/>
-        </w:rPr>
-        <w:t xml:space="preserve">  </w:t>
-      </w:r>
-      <w:r>
-        <w:rPr>
-          <w:rFonts w:eastAsiaTheme="majorEastAsia"/>
-          <w:noProof/>
-          <w:lang w:eastAsia="ro-RO"/>
-        </w:rPr>
+        <w:jc w:val="center"/>
+      </w:pPr>
+      <w:r>
         <w:drawing>
-          <wp:inline distT="0" distB="0" distL="0" distR="0" wp14:anchorId="752506B1" wp14:editId="287E97CF">
-            <wp:extent cx="5943600" cy="2546350"/>
-            <wp:effectExtent l="0" t="0" r="0" b="6350"/>
-            <wp:docPr id="11" name="Imagine 11"/>
+          <wp:inline distT="0" distB="0" distL="0" distR="0" wp14:anchorId="31F71409" wp14:editId="6EC876BB">
+            <wp:extent cx="6488903" cy="2108200"/>
+            <wp:effectExtent l="0" t="0" r="7620" b="6350"/>
+            <wp:docPr id="21" name="Imagine 21"/>
             <wp:cNvGraphicFramePr>
               <a:graphicFrameLocks xmlns:a="http://schemas.openxmlformats.org/drawingml/2006/main" noChangeAspect="1"/>
             </wp:cNvGraphicFramePr>
@@ -9381,7 +9371,7 @@
                   <pic:spPr>
                     <a:xfrm>
                       <a:off x="0" y="0"/>
-                      <a:ext cx="5943600" cy="2546350"/>
+                      <a:ext cx="6491038" cy="2108893"/>
                     </a:xfrm>
                     <a:prstGeom prst="rect">
                       <a:avLst/>
@@ -9401,7 +9391,7 @@
         <w:rPr>
           <w:rFonts w:ascii="Times New Roman" w:hAnsi="Times New Roman" w:cs="Times New Roman"/>
           <w:b w:val="0"/>
-          <w:color w:val="000000" w:themeColor="text1"/>
+          <w:color w:val="auto"/>
           <w:sz w:val="20"/>
           <w:szCs w:val="20"/>
         </w:rPr>
@@ -9410,7 +9400,7 @@
         <w:rPr>
           <w:rFonts w:ascii="Times New Roman" w:hAnsi="Times New Roman" w:cs="Times New Roman"/>
           <w:b w:val="0"/>
-          <w:color w:val="000000" w:themeColor="text1"/>
+          <w:color w:val="auto"/>
           <w:sz w:val="20"/>
           <w:szCs w:val="20"/>
         </w:rPr>
@@ -9420,7 +9410,7 @@
         <w:rPr>
           <w:rFonts w:ascii="Times New Roman" w:hAnsi="Times New Roman" w:cs="Times New Roman"/>
           <w:b w:val="0"/>
-          <w:color w:val="000000" w:themeColor="text1"/>
+          <w:color w:val="auto"/>
           <w:sz w:val="20"/>
           <w:szCs w:val="20"/>
         </w:rPr>
@@ -9430,7 +9420,7 @@
         <w:rPr>
           <w:rFonts w:ascii="Times New Roman" w:hAnsi="Times New Roman" w:cs="Times New Roman"/>
           <w:b w:val="0"/>
-          <w:color w:val="000000" w:themeColor="text1"/>
+          <w:color w:val="auto"/>
           <w:sz w:val="20"/>
           <w:szCs w:val="20"/>
         </w:rPr>
@@ -9440,7 +9430,7 @@
         <w:rPr>
           <w:rFonts w:ascii="Times New Roman" w:hAnsi="Times New Roman" w:cs="Times New Roman"/>
           <w:b w:val="0"/>
-          <w:color w:val="000000" w:themeColor="text1"/>
+          <w:color w:val="auto"/>
           <w:sz w:val="20"/>
           <w:szCs w:val="20"/>
         </w:rPr>
@@ -9451,7 +9441,7 @@
           <w:rFonts w:ascii="Times New Roman" w:hAnsi="Times New Roman" w:cs="Times New Roman"/>
           <w:b w:val="0"/>
           <w:noProof/>
-          <w:color w:val="000000" w:themeColor="text1"/>
+          <w:color w:val="auto"/>
           <w:sz w:val="20"/>
           <w:szCs w:val="20"/>
         </w:rPr>
@@ -9461,7 +9451,7 @@
         <w:rPr>
           <w:rFonts w:ascii="Times New Roman" w:hAnsi="Times New Roman" w:cs="Times New Roman"/>
           <w:b w:val="0"/>
-          <w:color w:val="000000" w:themeColor="text1"/>
+          <w:color w:val="auto"/>
           <w:sz w:val="20"/>
           <w:szCs w:val="20"/>
         </w:rPr>
@@ -9471,7 +9461,7 @@
         <w:rPr>
           <w:rFonts w:ascii="Times New Roman" w:hAnsi="Times New Roman" w:cs="Times New Roman"/>
           <w:b w:val="0"/>
-          <w:color w:val="000000" w:themeColor="text1"/>
+          <w:color w:val="auto"/>
           <w:sz w:val="20"/>
           <w:szCs w:val="20"/>
         </w:rPr>
@@ -9481,7 +9471,7 @@
         <w:rPr>
           <w:rFonts w:ascii="Times New Roman" w:hAnsi="Times New Roman" w:cs="Times New Roman"/>
           <w:b w:val="0"/>
-          <w:color w:val="000000" w:themeColor="text1"/>
+          <w:color w:val="auto"/>
           <w:sz w:val="20"/>
           <w:szCs w:val="20"/>
         </w:rPr>
@@ -9491,7 +9481,7 @@
         <w:rPr>
           <w:rFonts w:ascii="Times New Roman" w:hAnsi="Times New Roman" w:cs="Times New Roman"/>
           <w:b w:val="0"/>
-          <w:color w:val="000000" w:themeColor="text1"/>
+          <w:color w:val="auto"/>
           <w:sz w:val="20"/>
           <w:szCs w:val="20"/>
         </w:rPr>
@@ -9501,7 +9491,7 @@
         <w:rPr>
           <w:rFonts w:ascii="Times New Roman" w:hAnsi="Times New Roman" w:cs="Times New Roman"/>
           <w:b w:val="0"/>
-          <w:color w:val="000000" w:themeColor="text1"/>
+          <w:color w:val="auto"/>
           <w:sz w:val="20"/>
           <w:szCs w:val="20"/>
         </w:rPr>
@@ -9512,7 +9502,7 @@
           <w:rFonts w:ascii="Times New Roman" w:hAnsi="Times New Roman" w:cs="Times New Roman"/>
           <w:b w:val="0"/>
           <w:noProof/>
-          <w:color w:val="000000" w:themeColor="text1"/>
+          <w:color w:val="auto"/>
           <w:sz w:val="20"/>
           <w:szCs w:val="20"/>
         </w:rPr>
@@ -9522,7 +9512,7 @@
         <w:rPr>
           <w:rFonts w:ascii="Times New Roman" w:hAnsi="Times New Roman" w:cs="Times New Roman"/>
           <w:b w:val="0"/>
-          <w:color w:val="000000" w:themeColor="text1"/>
+          <w:color w:val="auto"/>
           <w:sz w:val="20"/>
           <w:szCs w:val="20"/>
         </w:rPr>
@@ -9546,6 +9536,199 @@
       <w:proofErr w:type="spellEnd"/>
       <w:r>
         <w:t xml:space="preserve"> (în cazul în care această opțiune este valabilă) sunt de fapt niște link-uri spre alte pagini, lucru evidențiat prin design-ul consacrat pentru acest tip de redirecționări. În dreapta sus se regăsesc două butoane, unul pentru opțiunea de adăugat un nou fișier, și cealaltă pentru ieșirea din aplicație de către utilizator.</w:t>
+      </w:r>
+    </w:p>
+    <w:p>
+      <w:pPr>
+        <w:pStyle w:val="Stil1"/>
+        <w:rPr>
+          <w:rFonts w:eastAsiaTheme="majorEastAsia"/>
+        </w:rPr>
+      </w:pPr>
+      <w:r>
+        <w:rPr>
+          <w:rFonts w:eastAsiaTheme="majorEastAsia"/>
+        </w:rPr>
+        <w:t xml:space="preserve">În Figura 4-4, se observă componenta pentru adăugarea unui nou fișier cu opțiuni clare pentru utilizator în comparație cu procesul mai anevoios de creare a unui fișier în Microsoft </w:t>
+      </w:r>
+      <w:proofErr w:type="spellStart"/>
+      <w:r>
+        <w:rPr>
+          <w:rFonts w:eastAsiaTheme="majorEastAsia"/>
+        </w:rPr>
+        <w:t>Azure</w:t>
+      </w:r>
+      <w:proofErr w:type="spellEnd"/>
+      <w:r>
+        <w:rPr>
+          <w:rFonts w:eastAsiaTheme="majorEastAsia"/>
+        </w:rPr>
+        <w:t xml:space="preserve"> (în caz în care nu există deja un </w:t>
+      </w:r>
+      <w:proofErr w:type="spellStart"/>
+      <w:r>
+        <w:rPr>
+          <w:rFonts w:eastAsiaTheme="majorEastAsia"/>
+        </w:rPr>
+        <w:t>Storage</w:t>
+      </w:r>
+      <w:proofErr w:type="spellEnd"/>
+      <w:r>
+        <w:rPr>
+          <w:rFonts w:eastAsiaTheme="majorEastAsia"/>
+        </w:rPr>
+        <w:t xml:space="preserve"> </w:t>
+      </w:r>
+      <w:proofErr w:type="spellStart"/>
+      <w:r>
+        <w:rPr>
+          <w:rFonts w:eastAsiaTheme="majorEastAsia"/>
+        </w:rPr>
+        <w:t>Account</w:t>
+      </w:r>
+      <w:proofErr w:type="spellEnd"/>
+      <w:r>
+        <w:rPr>
+          <w:rFonts w:eastAsiaTheme="majorEastAsia"/>
+        </w:rPr>
+        <w:t xml:space="preserve"> cu toate setările deja făcute). Cum pentru un utilizator obișnuit îl interesează doar scopul final, acela de a crea fișierul cu setările dorite, acest meniu de configurări este unul mai simplu și intuitiv de folosit.</w:t>
+      </w:r>
+      <w:r>
+        <w:rPr>
+          <w:rFonts w:eastAsiaTheme="majorEastAsia"/>
+        </w:rPr>
+        <w:t xml:space="preserve"> Putem observa de asemenea și utilizarea de mesaje informative, concise și clare, pentru a îndruma utilizatorul în alegerea celei mai bune opțiuni pentru interesele sale.</w:t>
+      </w:r>
+    </w:p>
+    <w:p>
+      <w:pPr>
+        <w:pStyle w:val="Stil1"/>
+        <w:rPr>
+          <w:rFonts w:eastAsiaTheme="majorEastAsia"/>
+        </w:rPr>
+      </w:pPr>
+      <w:r>
+        <w:rPr>
+          <w:rFonts w:eastAsiaTheme="majorEastAsia"/>
+        </w:rPr>
+        <w:t>Se regăsesc următoarele opțiuni pentru adăugarea de fișiere – nume (extensia e adăugată la final automat pe baza fișierului selectat local), zona de disponibilitate, tipul de redundanță (</w:t>
+      </w:r>
+      <w:proofErr w:type="spellStart"/>
+      <w:r>
+        <w:rPr>
+          <w:rFonts w:eastAsiaTheme="majorEastAsia"/>
+        </w:rPr>
+        <w:t>Locally</w:t>
+      </w:r>
+      <w:proofErr w:type="spellEnd"/>
+      <w:r>
+        <w:rPr>
+          <w:rFonts w:eastAsiaTheme="majorEastAsia"/>
+        </w:rPr>
+        <w:t xml:space="preserve">, Zone, </w:t>
+      </w:r>
+      <w:proofErr w:type="spellStart"/>
+      <w:r>
+        <w:rPr>
+          <w:rFonts w:eastAsiaTheme="majorEastAsia"/>
+        </w:rPr>
+        <w:t>Globally</w:t>
+      </w:r>
+      <w:proofErr w:type="spellEnd"/>
+      <w:r>
+        <w:rPr>
+          <w:rFonts w:eastAsiaTheme="majorEastAsia"/>
+        </w:rPr>
+        <w:t xml:space="preserve"> sau </w:t>
+      </w:r>
+      <w:proofErr w:type="spellStart"/>
+      <w:r>
+        <w:rPr>
+          <w:rFonts w:eastAsiaTheme="majorEastAsia"/>
+        </w:rPr>
+        <w:t>Custom</w:t>
+      </w:r>
+      <w:proofErr w:type="spellEnd"/>
+      <w:r>
+        <w:rPr>
+          <w:rFonts w:eastAsiaTheme="majorEastAsia"/>
+        </w:rPr>
+        <w:t xml:space="preserve">), a doua zonă de disponibilitate (acest al doilea </w:t>
+      </w:r>
+      <w:proofErr w:type="spellStart"/>
+      <w:r>
+        <w:rPr>
+          <w:rFonts w:eastAsiaTheme="majorEastAsia"/>
+        </w:rPr>
+        <w:t>dropdown</w:t>
+      </w:r>
+      <w:proofErr w:type="spellEnd"/>
+      <w:r>
+        <w:rPr>
+          <w:rFonts w:eastAsiaTheme="majorEastAsia"/>
+        </w:rPr>
+        <w:t xml:space="preserve"> este vizibil doar în cazul în care redundanța selectată este cea </w:t>
+      </w:r>
+      <w:proofErr w:type="spellStart"/>
+      <w:r>
+        <w:rPr>
+          <w:rFonts w:eastAsiaTheme="majorEastAsia"/>
+        </w:rPr>
+        <w:t>Custom</w:t>
+      </w:r>
+      <w:proofErr w:type="spellEnd"/>
+      <w:r>
+        <w:rPr>
+          <w:rFonts w:eastAsiaTheme="majorEastAsia"/>
+        </w:rPr>
+        <w:t xml:space="preserve"> iar opțiunile de selecție nu o includ pe cea de la zona primară de stocare), selectarea fișierului local, suportul pentru </w:t>
+      </w:r>
+      <w:proofErr w:type="spellStart"/>
+      <w:r>
+        <w:rPr>
+          <w:rFonts w:eastAsiaTheme="majorEastAsia"/>
+        </w:rPr>
+        <w:t>versionare</w:t>
+      </w:r>
+      <w:proofErr w:type="spellEnd"/>
+      <w:r>
+        <w:rPr>
+          <w:rFonts w:eastAsiaTheme="majorEastAsia"/>
+        </w:rPr>
+        <w:t xml:space="preserve"> (dacă </w:t>
+      </w:r>
+      <w:r>
+        <w:rPr>
+          <w:rFonts w:eastAsiaTheme="majorEastAsia"/>
+        </w:rPr>
+        <w:lastRenderedPageBreak/>
+        <w:t xml:space="preserve">această opțiune este bifată, atunci utilizatorul va trebui să specifice și un nume pentru versiunea de bază, câmp </w:t>
+      </w:r>
+      <w:proofErr w:type="spellStart"/>
+      <w:r>
+        <w:rPr>
+          <w:rFonts w:eastAsiaTheme="majorEastAsia"/>
+        </w:rPr>
+        <w:t>precompletat</w:t>
+      </w:r>
+      <w:proofErr w:type="spellEnd"/>
+      <w:r>
+        <w:rPr>
+          <w:rFonts w:eastAsiaTheme="majorEastAsia"/>
+        </w:rPr>
+        <w:t xml:space="preserve"> cu opțiunea Original).</w:t>
+      </w:r>
+      <w:r>
+        <w:rPr>
+          <w:rFonts w:eastAsiaTheme="majorEastAsia"/>
+        </w:rPr>
+        <w:t xml:space="preserve"> </w:t>
+      </w:r>
+      <w:r>
+        <w:rPr>
+          <w:rFonts w:eastAsiaTheme="majorEastAsia"/>
+        </w:rPr>
+        <w:t>Dacă tot procesul funcționează corect, atunci fișierul va fi adăugat în lista cu celelalte fișiere ale utilizatorului iar componenta se va închide, altfel un mesaj de eroare va fi afișat.</w:t>
       </w:r>
     </w:p>
     <w:p>
@@ -9555,15 +9738,11 @@
         <w:jc w:val="center"/>
       </w:pPr>
       <w:r>
-        <w:rPr>
-          <w:noProof/>
-          <w:lang w:eastAsia="ro-RO"/>
-        </w:rPr>
         <w:drawing>
-          <wp:inline distT="0" distB="0" distL="0" distR="0" wp14:anchorId="1B929C12" wp14:editId="627A1709">
-            <wp:extent cx="2641600" cy="1829126"/>
-            <wp:effectExtent l="0" t="0" r="6350" b="0"/>
-            <wp:docPr id="12" name="Imagine 12"/>
+          <wp:inline distT="0" distB="0" distL="0" distR="0" wp14:anchorId="586CAEFB" wp14:editId="5C81AF92">
+            <wp:extent cx="4188237" cy="2590800"/>
+            <wp:effectExtent l="0" t="0" r="3175" b="0"/>
+            <wp:docPr id="15" name="Imagine 15"/>
             <wp:cNvGraphicFramePr>
               <a:graphicFrameLocks xmlns:a="http://schemas.openxmlformats.org/drawingml/2006/main" noChangeAspect="1"/>
             </wp:cNvGraphicFramePr>
@@ -9583,7 +9762,7 @@
                   <pic:spPr>
                     <a:xfrm>
                       <a:off x="0" y="0"/>
-                      <a:ext cx="2641969" cy="1829382"/>
+                      <a:ext cx="4190910" cy="2592453"/>
                     </a:xfrm>
                     <a:prstGeom prst="rect">
                       <a:avLst/>
@@ -9603,7 +9782,7 @@
         <w:rPr>
           <w:rFonts w:ascii="Times New Roman" w:hAnsi="Times New Roman" w:cs="Times New Roman"/>
           <w:b w:val="0"/>
-          <w:color w:val="000000" w:themeColor="text1"/>
+          <w:color w:val="auto"/>
           <w:sz w:val="20"/>
           <w:szCs w:val="20"/>
         </w:rPr>
@@ -9612,7 +9791,7 @@
         <w:rPr>
           <w:rFonts w:ascii="Times New Roman" w:hAnsi="Times New Roman" w:cs="Times New Roman"/>
           <w:b w:val="0"/>
-          <w:color w:val="000000" w:themeColor="text1"/>
+          <w:color w:val="auto"/>
           <w:sz w:val="20"/>
           <w:szCs w:val="20"/>
         </w:rPr>
@@ -9622,7 +9801,7 @@
         <w:rPr>
           <w:rFonts w:ascii="Times New Roman" w:hAnsi="Times New Roman" w:cs="Times New Roman"/>
           <w:b w:val="0"/>
-          <w:color w:val="000000" w:themeColor="text1"/>
+          <w:color w:val="auto"/>
           <w:sz w:val="20"/>
           <w:szCs w:val="20"/>
         </w:rPr>
@@ -9632,7 +9811,7 @@
         <w:rPr>
           <w:rFonts w:ascii="Times New Roman" w:hAnsi="Times New Roman" w:cs="Times New Roman"/>
           <w:b w:val="0"/>
-          <w:color w:val="000000" w:themeColor="text1"/>
+          <w:color w:val="auto"/>
           <w:sz w:val="20"/>
           <w:szCs w:val="20"/>
         </w:rPr>
@@ -9642,7 +9821,7 @@
         <w:rPr>
           <w:rFonts w:ascii="Times New Roman" w:hAnsi="Times New Roman" w:cs="Times New Roman"/>
           <w:b w:val="0"/>
-          <w:color w:val="000000" w:themeColor="text1"/>
+          <w:color w:val="auto"/>
           <w:sz w:val="20"/>
           <w:szCs w:val="20"/>
         </w:rPr>
@@ -9653,7 +9832,7 @@
           <w:rFonts w:ascii="Times New Roman" w:hAnsi="Times New Roman" w:cs="Times New Roman"/>
           <w:b w:val="0"/>
           <w:noProof/>
-          <w:color w:val="000000" w:themeColor="text1"/>
+          <w:color w:val="auto"/>
           <w:sz w:val="20"/>
           <w:szCs w:val="20"/>
         </w:rPr>
@@ -9663,7 +9842,7 @@
         <w:rPr>
           <w:rFonts w:ascii="Times New Roman" w:hAnsi="Times New Roman" w:cs="Times New Roman"/>
           <w:b w:val="0"/>
-          <w:color w:val="000000" w:themeColor="text1"/>
+          <w:color w:val="auto"/>
           <w:sz w:val="20"/>
           <w:szCs w:val="20"/>
         </w:rPr>
@@ -9673,7 +9852,7 @@
         <w:rPr>
           <w:rFonts w:ascii="Times New Roman" w:hAnsi="Times New Roman" w:cs="Times New Roman"/>
           <w:b w:val="0"/>
-          <w:color w:val="000000" w:themeColor="text1"/>
+          <w:color w:val="auto"/>
           <w:sz w:val="20"/>
           <w:szCs w:val="20"/>
         </w:rPr>
@@ -9683,7 +9862,7 @@
         <w:rPr>
           <w:rFonts w:ascii="Times New Roman" w:hAnsi="Times New Roman" w:cs="Times New Roman"/>
           <w:b w:val="0"/>
-          <w:color w:val="000000" w:themeColor="text1"/>
+          <w:color w:val="auto"/>
           <w:sz w:val="20"/>
           <w:szCs w:val="20"/>
         </w:rPr>
@@ -9693,7 +9872,7 @@
         <w:rPr>
           <w:rFonts w:ascii="Times New Roman" w:hAnsi="Times New Roman" w:cs="Times New Roman"/>
           <w:b w:val="0"/>
-          <w:color w:val="000000" w:themeColor="text1"/>
+          <w:color w:val="auto"/>
           <w:sz w:val="20"/>
           <w:szCs w:val="20"/>
         </w:rPr>
@@ -9703,7 +9882,7 @@
         <w:rPr>
           <w:rFonts w:ascii="Times New Roman" w:hAnsi="Times New Roman" w:cs="Times New Roman"/>
           <w:b w:val="0"/>
-          <w:color w:val="000000" w:themeColor="text1"/>
+          <w:color w:val="auto"/>
           <w:sz w:val="20"/>
           <w:szCs w:val="20"/>
         </w:rPr>
@@ -9714,7 +9893,7 @@
           <w:rFonts w:ascii="Times New Roman" w:hAnsi="Times New Roman" w:cs="Times New Roman"/>
           <w:b w:val="0"/>
           <w:noProof/>
-          <w:color w:val="000000" w:themeColor="text1"/>
+          <w:color w:val="auto"/>
           <w:sz w:val="20"/>
           <w:szCs w:val="20"/>
         </w:rPr>
@@ -9724,7 +9903,7 @@
         <w:rPr>
           <w:rFonts w:ascii="Times New Roman" w:hAnsi="Times New Roman" w:cs="Times New Roman"/>
           <w:b w:val="0"/>
-          <w:color w:val="000000" w:themeColor="text1"/>
+          <w:color w:val="auto"/>
           <w:sz w:val="20"/>
           <w:szCs w:val="20"/>
         </w:rPr>
@@ -9742,191 +9921,94 @@
     <w:p>
       <w:pPr>
         <w:pStyle w:val="Stil1"/>
-        <w:rPr>
-          <w:rFonts w:eastAsiaTheme="majorEastAsia"/>
-        </w:rPr>
+      </w:pPr>
+      <w:r>
+        <w:t>Pagina pentru fiecare fișier în parte (Figura 4-5) va conține următoarele elemente</w:t>
+      </w:r>
+      <w:r>
+        <w:rPr>
+          <w:lang w:val="en-US"/>
+        </w:rPr>
+        <w:t xml:space="preserve">: </w:t>
+      </w:r>
+      <w:proofErr w:type="spellStart"/>
+      <w:r>
+        <w:t>previzualizarea</w:t>
+      </w:r>
+      <w:proofErr w:type="spellEnd"/>
+      <w:r>
+        <w:t xml:space="preserve"> fișierului și opțiuni pentru modificarea fișierului (se va deschide un modal asemănător cu cel prezentat anterior dar simplificat), </w:t>
+      </w:r>
+      <w:proofErr w:type="spellStart"/>
+      <w:r>
+        <w:t>download</w:t>
+      </w:r>
+      <w:proofErr w:type="spellEnd"/>
+      <w:r>
+        <w:t xml:space="preserve"> și întoarcerea spre pagina de pornire.</w:t>
+      </w:r>
+    </w:p>
+    <w:p>
+      <w:pPr>
+        <w:pStyle w:val="Stil1"/>
+      </w:pPr>
+      <w:r>
+        <w:t xml:space="preserve">În ceea ce privește pagina pentru </w:t>
+      </w:r>
+      <w:proofErr w:type="spellStart"/>
+      <w:r>
+        <w:t>versionare</w:t>
+      </w:r>
+      <w:proofErr w:type="spellEnd"/>
+      <w:r>
+        <w:t xml:space="preserve">, aceasta conține o listă cu toate versiunile pentru acel fișier, numele lor, când au fost adăugate și posibilitatea de </w:t>
+      </w:r>
+      <w:proofErr w:type="spellStart"/>
+      <w:r>
+        <w:t>download</w:t>
+      </w:r>
+      <w:proofErr w:type="spellEnd"/>
+      <w:r>
+        <w:t xml:space="preserve">, toate acestea într-un tabel precum cel din Figura 4-6. În partea dreapta sus, se vor regăsi butoanele pentru adăugarea unei noi versiuni, ce va deschide un nou modal pentru aceasta, și un buton de întoarcere spre pagina cu toate fișierele acelui utilizator. De asemenea, se poate observa și un buton de </w:t>
+      </w:r>
+      <w:proofErr w:type="spellStart"/>
+      <w:r>
+        <w:t>toggle</w:t>
+      </w:r>
+      <w:proofErr w:type="spellEnd"/>
+      <w:r>
+        <w:t xml:space="preserve"> care va face posibilă fie compararea de două versiuni între ele prin selectarea acestora, fie doar selectarea unui singur fișier spre </w:t>
+      </w:r>
+      <w:proofErr w:type="spellStart"/>
+      <w:r>
+        <w:t>previzualizare</w:t>
+      </w:r>
+      <w:proofErr w:type="spellEnd"/>
+      <w:r>
+        <w:t>.</w:t>
+      </w:r>
+    </w:p>
+    <w:p>
+      <w:pPr>
+        <w:pStyle w:val="Stil1"/>
+      </w:pPr>
+    </w:p>
+    <w:p>
+      <w:pPr>
+        <w:pStyle w:val="Stil1"/>
+        <w:keepNext/>
+        <w:jc w:val="center"/>
       </w:pPr>
       <w:r>
         <w:rPr>
           <w:rFonts w:eastAsiaTheme="majorEastAsia"/>
         </w:rPr>
         <w:lastRenderedPageBreak/>
-        <w:t xml:space="preserve">În </w:t>
-      </w:r>
-      <w:r>
-        <w:rPr>
-          <w:rFonts w:eastAsiaTheme="majorEastAsia"/>
-        </w:rPr>
-        <w:t>Figura 4</w:t>
-      </w:r>
-      <w:r>
-        <w:rPr>
-          <w:rFonts w:eastAsiaTheme="majorEastAsia"/>
-        </w:rPr>
-        <w:t xml:space="preserve">-4, se observă componenta pentru adăugarea unui nou fișier cu opțiuni clare pentru utilizator în comparație cu procesul mai anevoios de creare a unui fișier în Microsoft </w:t>
-      </w:r>
-      <w:proofErr w:type="spellStart"/>
-      <w:r>
-        <w:rPr>
-          <w:rFonts w:eastAsiaTheme="majorEastAsia"/>
-        </w:rPr>
-        <w:t>Azure</w:t>
-      </w:r>
-      <w:proofErr w:type="spellEnd"/>
-      <w:r>
-        <w:rPr>
-          <w:rFonts w:eastAsiaTheme="majorEastAsia"/>
-        </w:rPr>
-        <w:t xml:space="preserve"> (în caz în care nu există deja un </w:t>
-      </w:r>
-      <w:proofErr w:type="spellStart"/>
-      <w:r>
-        <w:rPr>
-          <w:rFonts w:eastAsiaTheme="majorEastAsia"/>
-        </w:rPr>
-        <w:t>Storage</w:t>
-      </w:r>
-      <w:proofErr w:type="spellEnd"/>
-      <w:r>
-        <w:rPr>
-          <w:rFonts w:eastAsiaTheme="majorEastAsia"/>
-        </w:rPr>
-        <w:t xml:space="preserve"> </w:t>
-      </w:r>
-      <w:proofErr w:type="spellStart"/>
-      <w:r>
-        <w:rPr>
-          <w:rFonts w:eastAsiaTheme="majorEastAsia"/>
-        </w:rPr>
-        <w:t>Account</w:t>
-      </w:r>
-      <w:proofErr w:type="spellEnd"/>
-      <w:r>
-        <w:rPr>
-          <w:rFonts w:eastAsiaTheme="majorEastAsia"/>
-        </w:rPr>
-        <w:t xml:space="preserve"> cu toate setările deja făcute). Cum pentru un utilizator obișnuit îl interesează doar scopul final, acela de a crea fișierul cu setările dorite, acest meniu de configurări este unul mai simplu și intuitiv de folosit. Se regăsesc următoarele opțiuni pentru adăugarea de fișiere – nume (extensia e adăugată la final automat pe baza fișierului selectat local), zona de disponibilitate, tipul de redundanță (</w:t>
-      </w:r>
-      <w:proofErr w:type="spellStart"/>
-      <w:r>
-        <w:rPr>
-          <w:rFonts w:eastAsiaTheme="majorEastAsia"/>
-        </w:rPr>
-        <w:t>Locally</w:t>
-      </w:r>
-      <w:proofErr w:type="spellEnd"/>
-      <w:r>
-        <w:rPr>
-          <w:rFonts w:eastAsiaTheme="majorEastAsia"/>
-        </w:rPr>
-        <w:t xml:space="preserve">, Zone, </w:t>
-      </w:r>
-      <w:proofErr w:type="spellStart"/>
-      <w:r>
-        <w:rPr>
-          <w:rFonts w:eastAsiaTheme="majorEastAsia"/>
-        </w:rPr>
-        <w:t>Globally</w:t>
-      </w:r>
-      <w:proofErr w:type="spellEnd"/>
-      <w:r>
-        <w:rPr>
-          <w:rFonts w:eastAsiaTheme="majorEastAsia"/>
-        </w:rPr>
-        <w:t xml:space="preserve"> sau </w:t>
-      </w:r>
-      <w:proofErr w:type="spellStart"/>
-      <w:r>
-        <w:rPr>
-          <w:rFonts w:eastAsiaTheme="majorEastAsia"/>
-        </w:rPr>
-        <w:t>Custom</w:t>
-      </w:r>
-      <w:proofErr w:type="spellEnd"/>
-      <w:r>
-        <w:rPr>
-          <w:rFonts w:eastAsiaTheme="majorEastAsia"/>
-        </w:rPr>
-        <w:t xml:space="preserve">), a doua zonă de disponibilitate (acest al doilea </w:t>
-      </w:r>
-      <w:proofErr w:type="spellStart"/>
-      <w:r>
-        <w:rPr>
-          <w:rFonts w:eastAsiaTheme="majorEastAsia"/>
-        </w:rPr>
-        <w:t>dropdown</w:t>
-      </w:r>
-      <w:proofErr w:type="spellEnd"/>
-      <w:r>
-        <w:rPr>
-          <w:rFonts w:eastAsiaTheme="majorEastAsia"/>
-        </w:rPr>
-        <w:t xml:space="preserve"> este vizibil doar în cazul în care redundanța selectată este cea </w:t>
-      </w:r>
-      <w:proofErr w:type="spellStart"/>
-      <w:r>
-        <w:rPr>
-          <w:rFonts w:eastAsiaTheme="majorEastAsia"/>
-        </w:rPr>
-        <w:t>Custom</w:t>
-      </w:r>
-      <w:proofErr w:type="spellEnd"/>
-      <w:r>
-        <w:rPr>
-          <w:rFonts w:eastAsiaTheme="majorEastAsia"/>
-        </w:rPr>
-        <w:t xml:space="preserve"> iar opțiunile de selecție nu o includ pe cea de la zona primară de stocare), selectarea fișierului local, suportul pentru </w:t>
-      </w:r>
-      <w:proofErr w:type="spellStart"/>
-      <w:r>
-        <w:rPr>
-          <w:rFonts w:eastAsiaTheme="majorEastAsia"/>
-        </w:rPr>
-        <w:t>versionare</w:t>
-      </w:r>
-      <w:proofErr w:type="spellEnd"/>
-      <w:r>
-        <w:rPr>
-          <w:rFonts w:eastAsiaTheme="majorEastAsia"/>
-        </w:rPr>
-        <w:t xml:space="preserve"> (dacă această opțiune este bifată, atunci utilizatorul va trebui să specifice și un nume pentru versiunea de bază, câmp </w:t>
-      </w:r>
-      <w:proofErr w:type="spellStart"/>
-      <w:r>
-        <w:rPr>
-          <w:rFonts w:eastAsiaTheme="majorEastAsia"/>
-        </w:rPr>
-        <w:t>precompletat</w:t>
-      </w:r>
-      <w:proofErr w:type="spellEnd"/>
-      <w:r>
-        <w:rPr>
-          <w:rFonts w:eastAsiaTheme="majorEastAsia"/>
-        </w:rPr>
-        <w:t xml:space="preserve"> cu opțiunea Original). Dacă tot procesul funcționează corect, atunci </w:t>
-      </w:r>
-      <w:r>
-        <w:rPr>
-          <w:rFonts w:eastAsiaTheme="majorEastAsia"/>
-        </w:rPr>
-        <w:t>fișierul va fi adăugat în lista cu celelalte fișiere ale utilizatorului iar componenta se va închide, altfel un mesaj de eroare va fi afișat.</w:t>
-      </w:r>
-    </w:p>
-    <w:p>
-      <w:pPr>
-        <w:keepNext/>
-      </w:pPr>
-      <w:r>
-        <w:rPr>
-          <w:rFonts w:eastAsiaTheme="majorEastAsia"/>
-          <w:noProof/>
-          <w:lang w:eastAsia="ro-RO"/>
-        </w:rPr>
         <w:drawing>
-          <wp:inline distT="0" distB="0" distL="0" distR="0" wp14:anchorId="00D28C77" wp14:editId="28635CB1">
-            <wp:extent cx="5943600" cy="2584450"/>
-            <wp:effectExtent l="0" t="0" r="0" b="6350"/>
-            <wp:docPr id="13" name="Imagine 13"/>
+          <wp:inline distT="0" distB="0" distL="0" distR="0" wp14:anchorId="76394C74" wp14:editId="0F36E4DF">
+            <wp:extent cx="5708267" cy="2545545"/>
+            <wp:effectExtent l="0" t="0" r="6985" b="7620"/>
+            <wp:docPr id="17" name="Imagine 17"/>
             <wp:cNvGraphicFramePr>
               <a:graphicFrameLocks xmlns:a="http://schemas.openxmlformats.org/drawingml/2006/main" noChangeAspect="1"/>
             </wp:cNvGraphicFramePr>
@@ -9946,7 +10028,7 @@
                   <pic:spPr>
                     <a:xfrm>
                       <a:off x="0" y="0"/>
-                      <a:ext cx="5943600" cy="2584450"/>
+                      <a:ext cx="5718440" cy="2550082"/>
                     </a:xfrm>
                     <a:prstGeom prst="rect">
                       <a:avLst/>
@@ -9964,9 +10046,9 @@
         <w:pStyle w:val="Legend"/>
         <w:jc w:val="center"/>
         <w:rPr>
-          <w:rFonts w:ascii="Times New Roman" w:hAnsi="Times New Roman" w:cs="Times New Roman"/>
+          <w:rFonts w:ascii="Times New Roman" w:eastAsiaTheme="majorEastAsia" w:hAnsi="Times New Roman" w:cs="Times New Roman"/>
           <w:b w:val="0"/>
-          <w:color w:val="000000" w:themeColor="text1"/>
+          <w:color w:val="auto"/>
           <w:sz w:val="20"/>
           <w:szCs w:val="20"/>
         </w:rPr>
@@ -9975,7 +10057,7 @@
         <w:rPr>
           <w:rFonts w:ascii="Times New Roman" w:hAnsi="Times New Roman" w:cs="Times New Roman"/>
           <w:b w:val="0"/>
-          <w:color w:val="000000" w:themeColor="text1"/>
+          <w:color w:val="auto"/>
           <w:sz w:val="20"/>
           <w:szCs w:val="20"/>
         </w:rPr>
@@ -9985,7 +10067,7 @@
         <w:rPr>
           <w:rFonts w:ascii="Times New Roman" w:hAnsi="Times New Roman" w:cs="Times New Roman"/>
           <w:b w:val="0"/>
-          <w:color w:val="000000" w:themeColor="text1"/>
+          <w:color w:val="auto"/>
           <w:sz w:val="20"/>
           <w:szCs w:val="20"/>
         </w:rPr>
@@ -9995,7 +10077,7 @@
         <w:rPr>
           <w:rFonts w:ascii="Times New Roman" w:hAnsi="Times New Roman" w:cs="Times New Roman"/>
           <w:b w:val="0"/>
-          <w:color w:val="000000" w:themeColor="text1"/>
+          <w:color w:val="auto"/>
           <w:sz w:val="20"/>
           <w:szCs w:val="20"/>
         </w:rPr>
@@ -10005,7 +10087,7 @@
         <w:rPr>
           <w:rFonts w:ascii="Times New Roman" w:hAnsi="Times New Roman" w:cs="Times New Roman"/>
           <w:b w:val="0"/>
-          <w:color w:val="000000" w:themeColor="text1"/>
+          <w:color w:val="auto"/>
           <w:sz w:val="20"/>
           <w:szCs w:val="20"/>
         </w:rPr>
@@ -10016,7 +10098,7 @@
           <w:rFonts w:ascii="Times New Roman" w:hAnsi="Times New Roman" w:cs="Times New Roman"/>
           <w:b w:val="0"/>
           <w:noProof/>
-          <w:color w:val="000000" w:themeColor="text1"/>
+          <w:color w:val="auto"/>
           <w:sz w:val="20"/>
           <w:szCs w:val="20"/>
         </w:rPr>
@@ -10026,7 +10108,7 @@
         <w:rPr>
           <w:rFonts w:ascii="Times New Roman" w:hAnsi="Times New Roman" w:cs="Times New Roman"/>
           <w:b w:val="0"/>
-          <w:color w:val="000000" w:themeColor="text1"/>
+          <w:color w:val="auto"/>
           <w:sz w:val="20"/>
           <w:szCs w:val="20"/>
         </w:rPr>
@@ -10036,7 +10118,7 @@
         <w:rPr>
           <w:rFonts w:ascii="Times New Roman" w:hAnsi="Times New Roman" w:cs="Times New Roman"/>
           <w:b w:val="0"/>
-          <w:color w:val="000000" w:themeColor="text1"/>
+          <w:color w:val="auto"/>
           <w:sz w:val="20"/>
           <w:szCs w:val="20"/>
         </w:rPr>
@@ -10046,7 +10128,7 @@
         <w:rPr>
           <w:rFonts w:ascii="Times New Roman" w:hAnsi="Times New Roman" w:cs="Times New Roman"/>
           <w:b w:val="0"/>
-          <w:color w:val="000000" w:themeColor="text1"/>
+          <w:color w:val="auto"/>
           <w:sz w:val="20"/>
           <w:szCs w:val="20"/>
         </w:rPr>
@@ -10056,7 +10138,7 @@
         <w:rPr>
           <w:rFonts w:ascii="Times New Roman" w:hAnsi="Times New Roman" w:cs="Times New Roman"/>
           <w:b w:val="0"/>
-          <w:color w:val="000000" w:themeColor="text1"/>
+          <w:color w:val="auto"/>
           <w:sz w:val="20"/>
           <w:szCs w:val="20"/>
         </w:rPr>
@@ -10066,7 +10148,7 @@
         <w:rPr>
           <w:rFonts w:ascii="Times New Roman" w:hAnsi="Times New Roman" w:cs="Times New Roman"/>
           <w:b w:val="0"/>
-          <w:color w:val="000000" w:themeColor="text1"/>
+          <w:color w:val="auto"/>
           <w:sz w:val="20"/>
           <w:szCs w:val="20"/>
         </w:rPr>
@@ -10077,7 +10159,7 @@
           <w:rFonts w:ascii="Times New Roman" w:hAnsi="Times New Roman" w:cs="Times New Roman"/>
           <w:b w:val="0"/>
           <w:noProof/>
-          <w:color w:val="000000" w:themeColor="text1"/>
+          <w:color w:val="auto"/>
           <w:sz w:val="20"/>
           <w:szCs w:val="20"/>
         </w:rPr>
@@ -10087,7 +10169,7 @@
         <w:rPr>
           <w:rFonts w:ascii="Times New Roman" w:hAnsi="Times New Roman" w:cs="Times New Roman"/>
           <w:b w:val="0"/>
-          <w:color w:val="000000" w:themeColor="text1"/>
+          <w:color w:val="auto"/>
           <w:sz w:val="20"/>
           <w:szCs w:val="20"/>
         </w:rPr>
@@ -10097,101 +10179,6 @@
     <w:p>
       <w:pPr>
         <w:pStyle w:val="Stil1"/>
-      </w:pPr>
-      <w:r>
-        <w:t>Pagina pentru fiecare fișier</w:t>
-      </w:r>
-      <w:r>
-        <w:t xml:space="preserve"> în parte (</w:t>
-      </w:r>
-      <w:r>
-        <w:t>Figura 4</w:t>
-      </w:r>
-      <w:r>
-        <w:t xml:space="preserve">-5) </w:t>
-      </w:r>
-      <w:r>
-        <w:t>va conține următoarele elemente</w:t>
-      </w:r>
-      <w:r>
-        <w:rPr>
-          <w:lang w:val="en-US"/>
-        </w:rPr>
-        <w:t xml:space="preserve">: </w:t>
-      </w:r>
-      <w:proofErr w:type="spellStart"/>
-      <w:r>
-        <w:t>previzualizarea</w:t>
-      </w:r>
-      <w:proofErr w:type="spellEnd"/>
-      <w:r>
-        <w:t xml:space="preserve"> fișierului</w:t>
-      </w:r>
-      <w:r>
-        <w:t xml:space="preserve"> și opțiuni pentru modificarea fișierului (se va deschide un modal asemănător cu cel prezentat anterior dar simplificat), </w:t>
-      </w:r>
-      <w:proofErr w:type="spellStart"/>
-      <w:r>
-        <w:t>download</w:t>
-      </w:r>
-      <w:proofErr w:type="spellEnd"/>
-      <w:r>
-        <w:t xml:space="preserve"> și întoarcerea spre pagina de pornire.</w:t>
-      </w:r>
-    </w:p>
-    <w:p>
-      <w:pPr>
-        <w:pStyle w:val="Stil1"/>
-      </w:pPr>
-      <w:r>
-        <w:lastRenderedPageBreak/>
-        <w:t xml:space="preserve">În ceea ce privește pagina pentru </w:t>
-      </w:r>
-      <w:proofErr w:type="spellStart"/>
-      <w:r>
-        <w:t>versionare</w:t>
-      </w:r>
-      <w:proofErr w:type="spellEnd"/>
-      <w:r>
-        <w:t xml:space="preserve">, aceasta conține o listă cu toate versiunile pentru acel fișier, numele lor, când au fost adăugate și posibilitatea de </w:t>
-      </w:r>
-      <w:proofErr w:type="spellStart"/>
-      <w:r>
-        <w:t>download</w:t>
-      </w:r>
-      <w:proofErr w:type="spellEnd"/>
-      <w:r>
-        <w:t xml:space="preserve">, toate acestea într-un tabel precum cel din </w:t>
-      </w:r>
-      <w:r>
-        <w:t>Figura 4</w:t>
-      </w:r>
-      <w:r>
-        <w:t xml:space="preserve">-6. În partea dreapta sus, se vor regăsi butoanele pentru adăugarea unei noi versiuni, ce va deschide un nou modal pentru aceasta, și un buton de întoarcere spre pagina cu toate fișierele acelui utilizator. De asemenea, se poate observa și </w:t>
-      </w:r>
-      <w:r>
-        <w:t xml:space="preserve">un buton de </w:t>
-      </w:r>
-      <w:proofErr w:type="spellStart"/>
-      <w:r>
-        <w:t>toggle</w:t>
-      </w:r>
-      <w:proofErr w:type="spellEnd"/>
-      <w:r>
-        <w:t xml:space="preserve"> care va face posibilă fie compararea de două versiuni între ele prin selectarea acestora, fie doar selectarea unui singur fișier spre </w:t>
-      </w:r>
-      <w:proofErr w:type="spellStart"/>
-      <w:r>
-        <w:t>previzualizare</w:t>
-      </w:r>
-      <w:proofErr w:type="spellEnd"/>
-      <w:r>
-        <w:t>.</w:t>
-      </w:r>
-    </w:p>
-    <w:p>
-      <w:pPr>
-        <w:pStyle w:val="Stil1"/>
         <w:keepNext/>
       </w:pPr>
       <w:r>
@@ -10200,9 +10187,9 @@
           <w:lang w:eastAsia="ro-RO"/>
         </w:rPr>
         <w:drawing>
-          <wp:inline distT="0" distB="0" distL="0" distR="0" wp14:anchorId="06E7B345" wp14:editId="01D50931">
-            <wp:extent cx="5943600" cy="2626360"/>
-            <wp:effectExtent l="0" t="0" r="0" b="2540"/>
+          <wp:inline distT="0" distB="0" distL="0" distR="0" wp14:anchorId="47F6F3B0" wp14:editId="67EF7503">
+            <wp:extent cx="5441950" cy="2404691"/>
+            <wp:effectExtent l="0" t="0" r="6350" b="0"/>
             <wp:docPr id="14" name="Imagine 14"/>
             <wp:cNvGraphicFramePr>
               <a:graphicFrameLocks xmlns:a="http://schemas.openxmlformats.org/drawingml/2006/main" noChangeAspect="1"/>
@@ -10223,7 +10210,7 @@
                   <pic:spPr>
                     <a:xfrm>
                       <a:off x="0" y="0"/>
-                      <a:ext cx="5943600" cy="2626360"/>
+                      <a:ext cx="5441950" cy="2404691"/>
                     </a:xfrm>
                     <a:prstGeom prst="rect">
                       <a:avLst/>
@@ -10405,7 +10392,11 @@
         <w:t>pași intermediari</w:t>
       </w:r>
       <w:r>
-        <w:t xml:space="preserve">, în cazul în care o operație eșuează atunci se vor afișa mesaje de eroare și de asemenea design-ul oferă posibilități de personificare prin elemente ca butonul de </w:t>
+        <w:t xml:space="preserve">, în cazul în care o operație eșuează atunci se vor afișa mesaje de eroare și de asemenea design-ul </w:t>
+      </w:r>
+      <w:r>
+        <w:lastRenderedPageBreak/>
+        <w:t xml:space="preserve">oferă posibilități de personificare prin elemente ca butonul de </w:t>
       </w:r>
       <w:proofErr w:type="spellStart"/>
       <w:r>
@@ -10441,7 +10432,6 @@
       </w:pPr>
       <w:bookmarkStart w:id="25" w:name="_Toc199891071"/>
       <w:r>
-        <w:lastRenderedPageBreak/>
         <w:t>Arhitectura</w:t>
       </w:r>
       <w:bookmarkEnd w:id="25"/>
@@ -10472,7 +10462,7 @@
           <w:lang w:eastAsia="ro-RO"/>
         </w:rPr>
         <w:drawing>
-          <wp:inline distT="0" distB="0" distL="0" distR="0" wp14:anchorId="64CE5196" wp14:editId="5A1CD334">
+          <wp:inline distT="0" distB="0" distL="0" distR="0" wp14:anchorId="6868D844" wp14:editId="193DA34A">
             <wp:extent cx="5943600" cy="2870200"/>
             <wp:effectExtent l="0" t="0" r="0" b="6350"/>
             <wp:docPr id="2" name="Imagine 2"/>
@@ -10735,7 +10725,11 @@
       </w:r>
       <w:proofErr w:type="spellEnd"/>
       <w:r>
-        <w:t>). Informațiile privitoare la fișiere, utilizatori, versiuni de fișiere</w:t>
+        <w:t xml:space="preserve">). Informațiile </w:t>
+      </w:r>
+      <w:r>
+        <w:lastRenderedPageBreak/>
+        <w:t>privitoare la fișiere, utilizatori, versiuni de fișiere</w:t>
       </w:r>
       <w:r>
         <w:t>, etc.</w:t>
@@ -10776,7 +10770,6 @@
         <w:pStyle w:val="Stil1"/>
       </w:pPr>
       <w:r>
-        <w:lastRenderedPageBreak/>
         <w:t xml:space="preserve">Vor fi folosite de asemenea și două </w:t>
       </w:r>
       <w:proofErr w:type="spellStart"/>
@@ -10803,6 +10796,335 @@
       <w:r>
         <w:t xml:space="preserve"> de redundanță oferită de aplicația noastră sunt sincronizate (în caz contrar, se va încerca modificarea conținutului copiei invalide și modificarea datelor corespunzătoare în cadrul bazei date).</w:t>
       </w:r>
+    </w:p>
+    <w:p>
+      <w:pPr>
+        <w:pStyle w:val="Stil1"/>
+        <w:rPr>
+          <w:rFonts w:eastAsiaTheme="majorEastAsia"/>
+        </w:rPr>
+      </w:pPr>
+      <w:r>
+        <w:rPr>
+          <w:rFonts w:eastAsiaTheme="majorEastAsia"/>
+        </w:rPr>
+        <w:t xml:space="preserve">Figura 4-8 reprezintă arhitectura aplicației în sine. Se observă ușor că este o aplicație cu o parte de back-end implementată folosind tehnologii ASP.NET și o parte de front-end realizată cu ajutorul </w:t>
+      </w:r>
+      <w:proofErr w:type="spellStart"/>
+      <w:r>
+        <w:rPr>
+          <w:rFonts w:eastAsiaTheme="majorEastAsia"/>
+        </w:rPr>
+        <w:t>React</w:t>
+      </w:r>
+      <w:proofErr w:type="spellEnd"/>
+      <w:r>
+        <w:rPr>
+          <w:rFonts w:eastAsiaTheme="majorEastAsia"/>
+        </w:rPr>
+        <w:t xml:space="preserve">. </w:t>
+      </w:r>
+    </w:p>
+    <w:p>
+      <w:pPr>
+        <w:pStyle w:val="Stil1"/>
+        <w:rPr>
+          <w:rFonts w:eastAsiaTheme="majorEastAsia"/>
+        </w:rPr>
+      </w:pPr>
+      <w:r>
+        <w:rPr>
+          <w:rFonts w:eastAsiaTheme="majorEastAsia"/>
+        </w:rPr>
+        <w:t>Partea de back</w:t>
+      </w:r>
+      <w:r>
+        <w:rPr>
+          <w:rFonts w:eastAsiaTheme="majorEastAsia"/>
+        </w:rPr>
+        <w:t>-</w:t>
+      </w:r>
+      <w:r>
+        <w:rPr>
+          <w:rFonts w:eastAsiaTheme="majorEastAsia"/>
+        </w:rPr>
+        <w:t xml:space="preserve">end este compusă din trei </w:t>
+      </w:r>
+      <w:r>
+        <w:rPr>
+          <w:rFonts w:eastAsiaTheme="majorEastAsia"/>
+        </w:rPr>
+        <w:t>nivele</w:t>
+      </w:r>
+      <w:r>
+        <w:rPr>
+          <w:rFonts w:eastAsiaTheme="majorEastAsia"/>
+        </w:rPr>
+        <w:t xml:space="preserve">: </w:t>
+      </w:r>
+      <w:r>
+        <w:rPr>
+          <w:rFonts w:eastAsiaTheme="majorEastAsia"/>
+        </w:rPr>
+        <w:t>nivelul</w:t>
+      </w:r>
+      <w:r>
+        <w:rPr>
+          <w:rFonts w:eastAsiaTheme="majorEastAsia"/>
+        </w:rPr>
+        <w:t xml:space="preserve"> de control (Controller </w:t>
+      </w:r>
+      <w:proofErr w:type="spellStart"/>
+      <w:r>
+        <w:rPr>
+          <w:rFonts w:eastAsiaTheme="majorEastAsia"/>
+        </w:rPr>
+        <w:t>Layer</w:t>
+      </w:r>
+      <w:proofErr w:type="spellEnd"/>
+      <w:r>
+        <w:rPr>
+          <w:rFonts w:eastAsiaTheme="majorEastAsia"/>
+        </w:rPr>
+        <w:t xml:space="preserve">), </w:t>
+      </w:r>
+      <w:r>
+        <w:rPr>
+          <w:rFonts w:eastAsiaTheme="majorEastAsia"/>
+        </w:rPr>
+        <w:t>nivelul</w:t>
+      </w:r>
+      <w:r>
+        <w:rPr>
+          <w:rFonts w:eastAsiaTheme="majorEastAsia"/>
+        </w:rPr>
+        <w:t xml:space="preserve"> de logică (</w:t>
+      </w:r>
+      <w:r>
+        <w:rPr>
+          <w:rFonts w:eastAsiaTheme="majorEastAsia"/>
+          <w:lang w:val="en-US"/>
+        </w:rPr>
+        <w:t>Business Logic Layer</w:t>
+      </w:r>
+      <w:r>
+        <w:rPr>
+          <w:rFonts w:eastAsiaTheme="majorEastAsia"/>
+        </w:rPr>
+        <w:t xml:space="preserve">) și </w:t>
+      </w:r>
+      <w:r>
+        <w:rPr>
+          <w:rFonts w:eastAsiaTheme="majorEastAsia"/>
+        </w:rPr>
+        <w:t>nivelul</w:t>
+      </w:r>
+      <w:r>
+        <w:rPr>
+          <w:rFonts w:eastAsiaTheme="majorEastAsia"/>
+        </w:rPr>
+        <w:t xml:space="preserve"> de abstractizare a datelor (</w:t>
+      </w:r>
+      <w:r>
+        <w:rPr>
+          <w:rFonts w:eastAsiaTheme="majorEastAsia"/>
+          <w:lang w:val="en-US"/>
+        </w:rPr>
+        <w:t>Data Abstraction Layer</w:t>
+      </w:r>
+      <w:r>
+        <w:rPr>
+          <w:rFonts w:eastAsiaTheme="majorEastAsia"/>
+        </w:rPr>
+        <w:t>), fiecare având responsabilități specifice care vor fi discutate în continuare. Partea de front</w:t>
+      </w:r>
+      <w:r>
+        <w:rPr>
+          <w:rFonts w:eastAsiaTheme="majorEastAsia"/>
+        </w:rPr>
+        <w:t>-</w:t>
+      </w:r>
+      <w:r>
+        <w:rPr>
+          <w:rFonts w:eastAsiaTheme="majorEastAsia"/>
+        </w:rPr>
+        <w:t xml:space="preserve">end are o structură diferită, specifică aplicațiilor </w:t>
+      </w:r>
+      <w:proofErr w:type="spellStart"/>
+      <w:r>
+        <w:rPr>
+          <w:rFonts w:eastAsiaTheme="majorEastAsia"/>
+        </w:rPr>
+        <w:t>React</w:t>
+      </w:r>
+      <w:proofErr w:type="spellEnd"/>
+      <w:r>
+        <w:rPr>
+          <w:rFonts w:eastAsiaTheme="majorEastAsia"/>
+        </w:rPr>
+        <w:t>. Fieca</w:t>
+      </w:r>
+      <w:r>
+        <w:rPr>
+          <w:rFonts w:eastAsiaTheme="majorEastAsia"/>
+        </w:rPr>
+        <w:t>re pagină este, de fapt, o</w:t>
+      </w:r>
+      <w:r>
+        <w:rPr>
+          <w:rFonts w:eastAsiaTheme="majorEastAsia"/>
+        </w:rPr>
+        <w:t xml:space="preserve"> component</w:t>
+      </w:r>
+      <w:r>
+        <w:rPr>
+          <w:rFonts w:eastAsiaTheme="majorEastAsia"/>
+        </w:rPr>
+        <w:t>ă</w:t>
+      </w:r>
+      <w:r>
+        <w:rPr>
+          <w:rFonts w:eastAsiaTheme="majorEastAsia"/>
+        </w:rPr>
+        <w:t xml:space="preserve"> funcțional</w:t>
+      </w:r>
+      <w:r>
+        <w:rPr>
+          <w:rFonts w:eastAsiaTheme="majorEastAsia"/>
+        </w:rPr>
+        <w:t>ă</w:t>
+      </w:r>
+      <w:r>
+        <w:rPr>
+          <w:rFonts w:eastAsiaTheme="majorEastAsia"/>
+        </w:rPr>
+        <w:t xml:space="preserve"> care poate utiliza și componente mai mici. În acest mod, sunt create structuri funcționale care pot fi reutilizate cu ușurință. Vom explica mai multe despre aceste aspecte mai târziu, concentrându-ne acum pe structura back</w:t>
+      </w:r>
+      <w:r>
+        <w:rPr>
+          <w:rFonts w:eastAsiaTheme="majorEastAsia"/>
+        </w:rPr>
+        <w:t>-end.</w:t>
+      </w:r>
+    </w:p>
+    <w:p>
+      <w:pPr>
+        <w:pStyle w:val="Stil1"/>
+        <w:rPr>
+          <w:rFonts w:eastAsiaTheme="majorEastAsia"/>
+        </w:rPr>
+      </w:pPr>
+      <w:r>
+        <w:rPr>
+          <w:rFonts w:eastAsiaTheme="majorEastAsia"/>
+          <w:b/>
+          <w:lang w:val="en-US"/>
+        </w:rPr>
+        <w:t>Data Abstraction Layer</w:t>
+      </w:r>
+      <w:r>
+        <w:rPr>
+          <w:rFonts w:eastAsiaTheme="majorEastAsia"/>
+          <w:b/>
+          <w:lang w:val="en-US"/>
+        </w:rPr>
+        <w:t xml:space="preserve"> (DAL)</w:t>
+      </w:r>
+      <w:r>
+        <w:rPr>
+          <w:rFonts w:eastAsiaTheme="majorEastAsia"/>
+        </w:rPr>
+        <w:t xml:space="preserve"> </w:t>
+      </w:r>
+      <w:proofErr w:type="gramStart"/>
+      <w:r>
+        <w:rPr>
+          <w:rFonts w:eastAsiaTheme="majorEastAsia"/>
+        </w:rPr>
+        <w:t>este</w:t>
+      </w:r>
+      <w:proofErr w:type="gramEnd"/>
+      <w:r>
+        <w:rPr>
+          <w:rFonts w:eastAsiaTheme="majorEastAsia"/>
+        </w:rPr>
+        <w:t xml:space="preserve"> responsabil pentru comunicarea cu baza de date.</w:t>
+      </w:r>
+      <w:r>
+        <w:rPr>
+          <w:rFonts w:eastAsiaTheme="majorEastAsia"/>
+        </w:rPr>
+        <w:t xml:space="preserve"> Realizat cu ajutorul </w:t>
+      </w:r>
+      <w:proofErr w:type="spellStart"/>
+      <w:r>
+        <w:rPr>
+          <w:rFonts w:eastAsiaTheme="majorEastAsia"/>
+        </w:rPr>
+        <w:t>Entity</w:t>
+      </w:r>
+      <w:proofErr w:type="spellEnd"/>
+      <w:r>
+        <w:rPr>
+          <w:rFonts w:eastAsiaTheme="majorEastAsia"/>
+        </w:rPr>
+        <w:t xml:space="preserve"> Framework, reprezintă locul în care sunt create entitățile ce vor fi folosite de-a lungul aplicației și care vor fi transpuse în tabele în baza de date. Modalitatea aleasă pentru crearea bazei de date este </w:t>
+      </w:r>
+      <w:proofErr w:type="spellStart"/>
+      <w:r>
+        <w:rPr>
+          <w:rFonts w:eastAsiaTheme="majorEastAsia"/>
+        </w:rPr>
+        <w:t>code-first</w:t>
+      </w:r>
+      <w:proofErr w:type="spellEnd"/>
+      <w:r>
+        <w:rPr>
+          <w:rFonts w:eastAsiaTheme="majorEastAsia"/>
+        </w:rPr>
+        <w:t xml:space="preserve">, ce implică mai întâi scrierea de cod pentru modele și apoi prin intermediul </w:t>
+      </w:r>
+      <w:proofErr w:type="spellStart"/>
+      <w:r>
+        <w:rPr>
+          <w:rFonts w:eastAsiaTheme="majorEastAsia"/>
+        </w:rPr>
+        <w:t>Enity</w:t>
+      </w:r>
+      <w:proofErr w:type="spellEnd"/>
+      <w:r>
+        <w:rPr>
+          <w:rFonts w:eastAsiaTheme="majorEastAsia"/>
+        </w:rPr>
+        <w:t xml:space="preserve"> Framework, sunt create tabelele. Pentru modificarea structurii tabelelor se folosesc migrări, cod generate de </w:t>
+      </w:r>
+      <w:proofErr w:type="spellStart"/>
+      <w:r>
+        <w:rPr>
+          <w:rFonts w:eastAsiaTheme="majorEastAsia"/>
+        </w:rPr>
+        <w:t>Entity</w:t>
+      </w:r>
+      <w:proofErr w:type="spellEnd"/>
+      <w:r>
+        <w:rPr>
+          <w:rFonts w:eastAsiaTheme="majorEastAsia"/>
+        </w:rPr>
+        <w:t xml:space="preserve"> Framework între două stări ale bazei de date cu modificările necesare. În Figura 4-9 se observă schema bazei date.</w:t>
+      </w:r>
+    </w:p>
+    <w:p>
+      <w:pPr>
+        <w:pStyle w:val="Stil1"/>
+        <w:rPr>
+          <w:rFonts w:eastAsiaTheme="majorEastAsia"/>
+        </w:rPr>
+      </w:pPr>
+    </w:p>
+    <w:p>
+      <w:pPr>
+        <w:pStyle w:val="Stil1"/>
+      </w:pPr>
     </w:p>
     <w:p>
       <w:pPr>
@@ -10815,8 +11137,9 @@
           <w:noProof/>
           <w:lang w:eastAsia="ro-RO"/>
         </w:rPr>
+        <w:lastRenderedPageBreak/>
         <w:drawing>
-          <wp:inline distT="0" distB="0" distL="0" distR="0" wp14:anchorId="1EDF53AD" wp14:editId="7899C8E5">
+          <wp:inline distT="0" distB="0" distL="0" distR="0" wp14:anchorId="6CAE07A6" wp14:editId="6B686D3A">
             <wp:extent cx="6197600" cy="5025618"/>
             <wp:effectExtent l="0" t="0" r="0" b="3810"/>
             <wp:docPr id="3" name="Imagine 3"/>
@@ -11003,365 +11326,6 @@
     <w:p>
       <w:pPr>
         <w:pStyle w:val="Stil1"/>
-        <w:rPr>
-          <w:rFonts w:eastAsiaTheme="majorEastAsia"/>
-        </w:rPr>
-      </w:pPr>
-      <w:r>
-        <w:rPr>
-          <w:rFonts w:eastAsiaTheme="majorEastAsia"/>
-        </w:rPr>
-        <w:t>Figura 4</w:t>
-      </w:r>
-      <w:r>
-        <w:rPr>
-          <w:rFonts w:eastAsiaTheme="majorEastAsia"/>
-        </w:rPr>
-        <w:t xml:space="preserve">-8 reprezintă arhitectura aplicației în sine. Se observă ușor că este o aplicație cu o parte de back-end implementată folosind tehnologii ASP.NET și o parte de front-end realizată cu ajutorul </w:t>
-      </w:r>
-      <w:proofErr w:type="spellStart"/>
-      <w:r>
-        <w:rPr>
-          <w:rFonts w:eastAsiaTheme="majorEastAsia"/>
-        </w:rPr>
-        <w:t>React</w:t>
-      </w:r>
-      <w:proofErr w:type="spellEnd"/>
-      <w:r>
-        <w:rPr>
-          <w:rFonts w:eastAsiaTheme="majorEastAsia"/>
-        </w:rPr>
-        <w:t xml:space="preserve">. </w:t>
-      </w:r>
-    </w:p>
-    <w:p>
-      <w:pPr>
-        <w:pStyle w:val="Stil1"/>
-        <w:rPr>
-          <w:rFonts w:eastAsiaTheme="majorEastAsia"/>
-        </w:rPr>
-      </w:pPr>
-      <w:r>
-        <w:rPr>
-          <w:rFonts w:eastAsiaTheme="majorEastAsia"/>
-        </w:rPr>
-        <w:lastRenderedPageBreak/>
-        <w:t>Partea de back</w:t>
-      </w:r>
-      <w:r>
-        <w:rPr>
-          <w:rFonts w:eastAsiaTheme="majorEastAsia"/>
-        </w:rPr>
-        <w:t>-</w:t>
-      </w:r>
-      <w:r>
-        <w:rPr>
-          <w:rFonts w:eastAsiaTheme="majorEastAsia"/>
-        </w:rPr>
-        <w:t xml:space="preserve">end este compusă din trei </w:t>
-      </w:r>
-      <w:r>
-        <w:rPr>
-          <w:rFonts w:eastAsiaTheme="majorEastAsia"/>
-        </w:rPr>
-        <w:t>nivele</w:t>
-      </w:r>
-      <w:r>
-        <w:rPr>
-          <w:rFonts w:eastAsiaTheme="majorEastAsia"/>
-        </w:rPr>
-        <w:t xml:space="preserve">: </w:t>
-      </w:r>
-      <w:r>
-        <w:rPr>
-          <w:rFonts w:eastAsiaTheme="majorEastAsia"/>
-        </w:rPr>
-        <w:t>nivelul</w:t>
-      </w:r>
-      <w:r>
-        <w:rPr>
-          <w:rFonts w:eastAsiaTheme="majorEastAsia"/>
-        </w:rPr>
-        <w:t xml:space="preserve"> de control (Controller </w:t>
-      </w:r>
-      <w:proofErr w:type="spellStart"/>
-      <w:r>
-        <w:rPr>
-          <w:rFonts w:eastAsiaTheme="majorEastAsia"/>
-        </w:rPr>
-        <w:t>Layer</w:t>
-      </w:r>
-      <w:proofErr w:type="spellEnd"/>
-      <w:r>
-        <w:rPr>
-          <w:rFonts w:eastAsiaTheme="majorEastAsia"/>
-        </w:rPr>
-        <w:t xml:space="preserve">), </w:t>
-      </w:r>
-      <w:r>
-        <w:rPr>
-          <w:rFonts w:eastAsiaTheme="majorEastAsia"/>
-        </w:rPr>
-        <w:t>nivelul</w:t>
-      </w:r>
-      <w:r>
-        <w:rPr>
-          <w:rFonts w:eastAsiaTheme="majorEastAsia"/>
-        </w:rPr>
-        <w:t xml:space="preserve"> de logică (</w:t>
-      </w:r>
-      <w:r>
-        <w:rPr>
-          <w:rFonts w:eastAsiaTheme="majorEastAsia"/>
-          <w:lang w:val="en-US"/>
-        </w:rPr>
-        <w:t>Business Logic Layer</w:t>
-      </w:r>
-      <w:r>
-        <w:rPr>
-          <w:rFonts w:eastAsiaTheme="majorEastAsia"/>
-        </w:rPr>
-        <w:t xml:space="preserve">) și </w:t>
-      </w:r>
-      <w:r>
-        <w:rPr>
-          <w:rFonts w:eastAsiaTheme="majorEastAsia"/>
-        </w:rPr>
-        <w:t>nivelul</w:t>
-      </w:r>
-      <w:r>
-        <w:rPr>
-          <w:rFonts w:eastAsiaTheme="majorEastAsia"/>
-        </w:rPr>
-        <w:t xml:space="preserve"> de abstractizare a datelor (</w:t>
-      </w:r>
-      <w:r>
-        <w:rPr>
-          <w:rFonts w:eastAsiaTheme="majorEastAsia"/>
-          <w:lang w:val="en-US"/>
-        </w:rPr>
-        <w:t>Data Abstraction Layer</w:t>
-      </w:r>
-      <w:r>
-        <w:rPr>
-          <w:rFonts w:eastAsiaTheme="majorEastAsia"/>
-        </w:rPr>
-        <w:t>), fiecare având responsabilități specifice care vor fi discutate în continuare. Partea de front</w:t>
-      </w:r>
-      <w:r>
-        <w:rPr>
-          <w:rFonts w:eastAsiaTheme="majorEastAsia"/>
-        </w:rPr>
-        <w:t>-</w:t>
-      </w:r>
-      <w:r>
-        <w:rPr>
-          <w:rFonts w:eastAsiaTheme="majorEastAsia"/>
-        </w:rPr>
-        <w:t xml:space="preserve">end are o structură diferită, specifică aplicațiilor </w:t>
-      </w:r>
-      <w:proofErr w:type="spellStart"/>
-      <w:r>
-        <w:rPr>
-          <w:rFonts w:eastAsiaTheme="majorEastAsia"/>
-        </w:rPr>
-        <w:t>React</w:t>
-      </w:r>
-      <w:proofErr w:type="spellEnd"/>
-      <w:r>
-        <w:rPr>
-          <w:rFonts w:eastAsiaTheme="majorEastAsia"/>
-        </w:rPr>
-        <w:t>. Fieca</w:t>
-      </w:r>
-      <w:r>
-        <w:rPr>
-          <w:rFonts w:eastAsiaTheme="majorEastAsia"/>
-        </w:rPr>
-        <w:t>re pagină este, de fapt, o</w:t>
-      </w:r>
-      <w:r>
-        <w:rPr>
-          <w:rFonts w:eastAsiaTheme="majorEastAsia"/>
-        </w:rPr>
-        <w:t xml:space="preserve"> component</w:t>
-      </w:r>
-      <w:r>
-        <w:rPr>
-          <w:rFonts w:eastAsiaTheme="majorEastAsia"/>
-        </w:rPr>
-        <w:t>ă</w:t>
-      </w:r>
-      <w:r>
-        <w:rPr>
-          <w:rFonts w:eastAsiaTheme="majorEastAsia"/>
-        </w:rPr>
-        <w:t xml:space="preserve"> funcțional</w:t>
-      </w:r>
-      <w:r>
-        <w:rPr>
-          <w:rFonts w:eastAsiaTheme="majorEastAsia"/>
-        </w:rPr>
-        <w:t>ă</w:t>
-      </w:r>
-      <w:r>
-        <w:rPr>
-          <w:rFonts w:eastAsiaTheme="majorEastAsia"/>
-        </w:rPr>
-        <w:t xml:space="preserve"> care poate utiliza și componente mai mici. În acest mod, sunt create structuri funcționale care pot fi reutilizate cu ușurință. Vom explica mai multe despre aceste aspecte mai târziu, concentrându-ne acum pe structura back</w:t>
-      </w:r>
-      <w:r>
-        <w:rPr>
-          <w:rFonts w:eastAsiaTheme="majorEastAsia"/>
-        </w:rPr>
-        <w:t>-end.</w:t>
-      </w:r>
-    </w:p>
-    <w:p>
-      <w:pPr>
-        <w:pStyle w:val="Stil1"/>
-        <w:rPr>
-          <w:rFonts w:eastAsiaTheme="majorEastAsia"/>
-        </w:rPr>
-      </w:pPr>
-      <w:r>
-        <w:rPr>
-          <w:rFonts w:eastAsiaTheme="majorEastAsia"/>
-          <w:b/>
-          <w:lang w:val="en-US"/>
-        </w:rPr>
-        <w:t>Data Abstraction Layer</w:t>
-      </w:r>
-      <w:r>
-        <w:rPr>
-          <w:rFonts w:eastAsiaTheme="majorEastAsia"/>
-          <w:b/>
-          <w:lang w:val="en-US"/>
-        </w:rPr>
-        <w:t xml:space="preserve"> (DAL)</w:t>
-      </w:r>
-      <w:r>
-        <w:rPr>
-          <w:rFonts w:eastAsiaTheme="majorEastAsia"/>
-        </w:rPr>
-        <w:t xml:space="preserve"> </w:t>
-      </w:r>
-      <w:proofErr w:type="gramStart"/>
-      <w:r>
-        <w:rPr>
-          <w:rFonts w:eastAsiaTheme="majorEastAsia"/>
-        </w:rPr>
-        <w:t>este</w:t>
-      </w:r>
-      <w:proofErr w:type="gramEnd"/>
-      <w:r>
-        <w:rPr>
-          <w:rFonts w:eastAsiaTheme="majorEastAsia"/>
-        </w:rPr>
-        <w:t xml:space="preserve"> responsabil pentru comunicarea cu baza de date.</w:t>
-      </w:r>
-      <w:r>
-        <w:rPr>
-          <w:rFonts w:eastAsiaTheme="majorEastAsia"/>
-        </w:rPr>
-        <w:t xml:space="preserve"> Realizat cu ajutorul </w:t>
-      </w:r>
-      <w:proofErr w:type="spellStart"/>
-      <w:r>
-        <w:rPr>
-          <w:rFonts w:eastAsiaTheme="majorEastAsia"/>
-        </w:rPr>
-        <w:t>Entity</w:t>
-      </w:r>
-      <w:proofErr w:type="spellEnd"/>
-      <w:r>
-        <w:rPr>
-          <w:rFonts w:eastAsiaTheme="majorEastAsia"/>
-        </w:rPr>
-        <w:t xml:space="preserve"> Framework, reprezintă locul în care sunt create entitățile ce vor fi folosite de-a lungul aplicației și care vor fi transpuse în tabele în baza de date. Modalitatea aleasă pentru crearea bazei de date este </w:t>
-      </w:r>
-      <w:proofErr w:type="spellStart"/>
-      <w:r>
-        <w:rPr>
-          <w:rFonts w:eastAsiaTheme="majorEastAsia"/>
-        </w:rPr>
-        <w:t>code-first</w:t>
-      </w:r>
-      <w:proofErr w:type="spellEnd"/>
-      <w:r>
-        <w:rPr>
-          <w:rFonts w:eastAsiaTheme="majorEastAsia"/>
-        </w:rPr>
-        <w:t xml:space="preserve">, ce implică mai întâi scrierea de cod pentru modele și apoi prin intermediul </w:t>
-      </w:r>
-      <w:proofErr w:type="spellStart"/>
-      <w:r>
-        <w:rPr>
-          <w:rFonts w:eastAsiaTheme="majorEastAsia"/>
-        </w:rPr>
-        <w:t>Enity</w:t>
-      </w:r>
-      <w:proofErr w:type="spellEnd"/>
-      <w:r>
-        <w:rPr>
-          <w:rFonts w:eastAsiaTheme="majorEastAsia"/>
-        </w:rPr>
-        <w:t xml:space="preserve"> Framework</w:t>
-      </w:r>
-      <w:r>
-        <w:rPr>
-          <w:rFonts w:eastAsiaTheme="majorEastAsia"/>
-        </w:rPr>
-        <w:t>,</w:t>
-      </w:r>
-      <w:r>
-        <w:rPr>
-          <w:rFonts w:eastAsiaTheme="majorEastAsia"/>
-        </w:rPr>
-        <w:t xml:space="preserve"> sunt create tabelele. Pentru modificarea structurii tabelelor se folosesc migrări</w:t>
-      </w:r>
-      <w:r>
-        <w:rPr>
-          <w:rFonts w:eastAsiaTheme="majorEastAsia"/>
-        </w:rPr>
-        <w:t xml:space="preserve">, cod generate de </w:t>
-      </w:r>
-      <w:proofErr w:type="spellStart"/>
-      <w:r>
-        <w:rPr>
-          <w:rFonts w:eastAsiaTheme="majorEastAsia"/>
-        </w:rPr>
-        <w:t>Entity</w:t>
-      </w:r>
-      <w:proofErr w:type="spellEnd"/>
-      <w:r>
-        <w:rPr>
-          <w:rFonts w:eastAsiaTheme="majorEastAsia"/>
-        </w:rPr>
-        <w:t xml:space="preserve"> Framework între două stări ale bazei de date cu modificările necesare</w:t>
-      </w:r>
-      <w:r>
-        <w:rPr>
-          <w:rFonts w:eastAsiaTheme="majorEastAsia"/>
-        </w:rPr>
-        <w:t xml:space="preserve">. În </w:t>
-      </w:r>
-      <w:r>
-        <w:rPr>
-          <w:rFonts w:eastAsiaTheme="majorEastAsia"/>
-        </w:rPr>
-        <w:t>Figura 4</w:t>
-      </w:r>
-      <w:r>
-        <w:rPr>
-          <w:rFonts w:eastAsiaTheme="majorEastAsia"/>
-        </w:rPr>
-        <w:t>-9 se observă schema bazei date.</w:t>
-      </w:r>
-    </w:p>
-    <w:p>
-      <w:pPr>
-        <w:pStyle w:val="Stil1"/>
         <w:keepNext/>
         <w:jc w:val="center"/>
       </w:pPr>
@@ -11372,9 +11336,9 @@
           <w:lang w:eastAsia="ro-RO"/>
         </w:rPr>
         <w:drawing>
-          <wp:inline distT="0" distB="0" distL="0" distR="0" wp14:anchorId="3EBCEA1C" wp14:editId="706E03D1">
-            <wp:extent cx="4777322" cy="3568700"/>
-            <wp:effectExtent l="0" t="0" r="4445" b="0"/>
+          <wp:inline distT="0" distB="0" distL="0" distR="0" wp14:anchorId="20334913" wp14:editId="6A87333E">
+            <wp:extent cx="3098800" cy="2314830"/>
+            <wp:effectExtent l="0" t="0" r="6350" b="9525"/>
             <wp:docPr id="4" name="Imagine 4"/>
             <wp:cNvGraphicFramePr>
               <a:graphicFrameLocks xmlns:a="http://schemas.openxmlformats.org/drawingml/2006/main" noChangeAspect="1"/>
@@ -11395,7 +11359,7 @@
                   <pic:spPr>
                     <a:xfrm>
                       <a:off x="0" y="0"/>
-                      <a:ext cx="4779325" cy="3570196"/>
+                      <a:ext cx="3105069" cy="2319513"/>
                     </a:xfrm>
                     <a:prstGeom prst="rect">
                       <a:avLst/>
@@ -11565,7 +11529,6 @@
           <w:rFonts w:eastAsiaTheme="majorEastAsia"/>
           <w:b/>
         </w:rPr>
-        <w:lastRenderedPageBreak/>
         <w:t xml:space="preserve">Business Logic </w:t>
       </w:r>
       <w:proofErr w:type="spellStart"/>
@@ -12054,10 +12017,38 @@
     </w:p>
     <w:p>
       <w:pPr>
+        <w:pStyle w:val="Stil1"/>
+        <w:jc w:val="left"/>
+        <w:rPr>
+          <w:rFonts w:eastAsiaTheme="majorEastAsia"/>
+        </w:rPr>
+      </w:pPr>
+    </w:p>
+    <w:p>
+      <w:pPr>
+        <w:pStyle w:val="Stil1"/>
+        <w:jc w:val="left"/>
+        <w:rPr>
+          <w:rFonts w:eastAsiaTheme="majorEastAsia"/>
+        </w:rPr>
+      </w:pPr>
+    </w:p>
+    <w:p>
+      <w:pPr>
+        <w:pStyle w:val="Stil1"/>
+        <w:jc w:val="left"/>
+        <w:rPr>
+          <w:rFonts w:eastAsiaTheme="majorEastAsia"/>
+        </w:rPr>
+      </w:pPr>
+    </w:p>
+    <w:p>
+      <w:pPr>
         <w:pStyle w:val="Titlu2"/>
       </w:pPr>
       <w:bookmarkStart w:id="26" w:name="_Toc199891072"/>
       <w:r>
+        <w:lastRenderedPageBreak/>
         <w:t>Implementare</w:t>
       </w:r>
       <w:bookmarkEnd w:id="26"/>
@@ -12087,7 +12078,6 @@
         <w:rPr>
           <w:rFonts w:eastAsiaTheme="majorEastAsia"/>
         </w:rPr>
-        <w:lastRenderedPageBreak/>
         <w:t>Voi începe cu partea de CI/CD. Cum aceasta este o aplicație cloud, o soluție mulțumitoare pentru păstrarea codului într-un loc sigur și opțiunea de a modifica conținutul aplicației găzduite în c</w:t>
       </w:r>
       <w:r>
@@ -12312,7 +12302,7 @@
           <w:lang w:eastAsia="ro-RO"/>
         </w:rPr>
         <w:drawing>
-          <wp:inline distT="0" distB="0" distL="0" distR="0" wp14:anchorId="47956C5A" wp14:editId="4A6A8340">
+          <wp:inline distT="0" distB="0" distL="0" distR="0" wp14:anchorId="5FC5CD74" wp14:editId="4267C59D">
             <wp:extent cx="5105400" cy="3863413"/>
             <wp:effectExtent l="0" t="0" r="0" b="3810"/>
             <wp:docPr id="5" name="Imagine 5"/>
@@ -12494,6 +12484,7 @@
         <w:rPr>
           <w:rFonts w:eastAsiaTheme="majorEastAsia"/>
         </w:rPr>
+        <w:lastRenderedPageBreak/>
         <w:t>O altă problemă pe care am întâmpinat-o pe partea de CI/CD a fost cum ar trebui menținută baza de date la zi cu modificările pe care modelele le-au suferit ulterior. Soluția a fost una destul de simplă, fiind necesar ca în codul de start pentru aplicație să se verifice mai întâi dacă sunt migrări care nu au fost încă aplicate pe baza de date, iar dacă acesta este cazul, migrările respective să fie integrate, prin modificarea bazei de date în mod corespunzător. Migrările</w:t>
       </w:r>
       <w:r>
@@ -12514,14 +12505,7 @@
         <w:rPr>
           <w:rFonts w:eastAsiaTheme="majorEastAsia"/>
         </w:rPr>
-        <w:t xml:space="preserve"> Framework </w:t>
-      </w:r>
-      <w:r>
-        <w:rPr>
-          <w:rFonts w:eastAsiaTheme="majorEastAsia"/>
-        </w:rPr>
-        <w:lastRenderedPageBreak/>
-        <w:t>reprezintă un mecanism prin care modificările aduse modelului de date (clasele C#) sunt sincronizate cu schema bazei de date. Practic, ele permit actualizarea structurii bazei de date fără a pierde datele existente.</w:t>
+        <w:t xml:space="preserve"> Framework reprezintă un mecanism prin care modificările aduse modelului de date (clasele C#) sunt sincronizate cu schema bazei de date. Practic, ele permit actualizarea structurii bazei de date fără a pierde datele existente.</w:t>
       </w:r>
     </w:p>
     <w:p>
@@ -12597,7 +12581,7 @@
           <w:lang w:eastAsia="ro-RO"/>
         </w:rPr>
         <w:drawing>
-          <wp:inline distT="0" distB="0" distL="0" distR="0" wp14:anchorId="7339FDD2" wp14:editId="12CB5DBF">
+          <wp:inline distT="0" distB="0" distL="0" distR="0" wp14:anchorId="2214F626" wp14:editId="1933C8AE">
             <wp:extent cx="4925939" cy="2735580"/>
             <wp:effectExtent l="0" t="0" r="8255" b="7620"/>
             <wp:docPr id="7" name="Imagine 7"/>
@@ -12806,7 +12790,11 @@
         <w:t xml:space="preserve"> Ce este mai interesant de menționat pe această parte este modul în care aceste</w:t>
       </w:r>
       <w:r>
-        <w:t xml:space="preserve"> clase sunt inițializate cu câte un obiect pentru fiecare clasă de nivel inferior de care au nevoie. Astfel, în fișierul </w:t>
+        <w:t xml:space="preserve"> clase sunt inițializate cu câte un obiect </w:t>
+      </w:r>
+      <w:r>
+        <w:lastRenderedPageBreak/>
+        <w:t xml:space="preserve">pentru fiecare clasă de nivel inferior de care au nevoie. Astfel, în fișierul </w:t>
       </w:r>
       <w:proofErr w:type="spellStart"/>
       <w:r>
@@ -12852,11 +12840,7 @@
         <w:t>cerere</w:t>
       </w:r>
       <w:r>
-        <w:t xml:space="preserve"> HTTP. Aceasta permite injectarea automată a clasei acolo unde este </w:t>
-      </w:r>
-      <w:r>
-        <w:lastRenderedPageBreak/>
-        <w:t>necesară</w:t>
+        <w:t xml:space="preserve"> HTTP. Aceasta permite injectarea automată a clasei acolo unde este necesară</w:t>
       </w:r>
       <w:r>
         <w:t xml:space="preserve"> (de exemplu, în constructorul clasei </w:t>
@@ -12944,7 +12928,7 @@
                 <w:lang w:eastAsia="ro-RO"/>
               </w:rPr>
               <w:drawing>
-                <wp:inline distT="0" distB="0" distL="0" distR="0" wp14:anchorId="1ED836FD" wp14:editId="67C25024">
+                <wp:inline distT="0" distB="0" distL="0" distR="0" wp14:anchorId="72A66984" wp14:editId="752AD088">
                   <wp:extent cx="2933115" cy="1104900"/>
                   <wp:effectExtent l="0" t="0" r="635" b="0"/>
                   <wp:docPr id="8" name="Imagine 8"/>
@@ -13140,7 +13124,7 @@
                 <w:lang w:eastAsia="ro-RO"/>
               </w:rPr>
               <w:drawing>
-                <wp:inline distT="0" distB="0" distL="0" distR="0" wp14:anchorId="248952D1" wp14:editId="433AD851">
+                <wp:inline distT="0" distB="0" distL="0" distR="0" wp14:anchorId="068EDAAF" wp14:editId="316826FE">
                   <wp:extent cx="3128210" cy="1104900"/>
                   <wp:effectExtent l="0" t="0" r="0" b="0"/>
                   <wp:docPr id="9" name="Imagine 9"/>
@@ -13447,6 +13431,7 @@
         <w:pStyle w:val="Stil1"/>
       </w:pPr>
       <w:r>
+        <w:lastRenderedPageBreak/>
         <w:t xml:space="preserve">Modelul propus pentru rezolvarea problemei se rezumă pe folosirea de două fișiere separate salvate ca LRS în zonele selectate de către utilizator. Pentru a asigura o consistență a conținutului acestor fișiere, de fiecare dată când un fișier este din nou </w:t>
       </w:r>
       <w:proofErr w:type="spellStart"/>
@@ -13479,79 +13464,159 @@
       </w:r>
       <w:proofErr w:type="spellEnd"/>
       <w:r>
-        <w:t xml:space="preserve"> (când a început operația pentru ambele fișiere). Când </w:t>
+        <w:t xml:space="preserve"> (când a început operația pentru ambele fișiere). Când utilizatorul va dori să modifice conținutul fișierului, aplicația va stabili timpul inițial de dinainte de modificarea propriu-zisă a celor 2 fișiere în cloud. În cazul în care modificarea se realizează cu succes, pentru fiecare din cele 2 fișiere, se va modifica în baza de date ultimul timp de modificare pentru acea copie (de notat, dacă operația de modificare reușește doar pentru o singură copie atunci doar o singură intrare din baza de date va fi actualizată). Practic, se încearcă un </w:t>
+      </w:r>
+      <w:proofErr w:type="spellStart"/>
+      <w:r>
+        <w:t>mirroring</w:t>
+      </w:r>
+      <w:proofErr w:type="spellEnd"/>
+      <w:r>
+        <w:t xml:space="preserve"> al datelor la operația de modificare prin schimbarea în mod sincron a celor două copii de fișiere.</w:t>
+      </w:r>
+    </w:p>
+    <w:p>
+      <w:pPr>
+        <w:pStyle w:val="Stil1"/>
+      </w:pPr>
+      <w:r>
+        <w:t xml:space="preserve">Poate că acest procedeu de salvat ultimul timp de </w:t>
+      </w:r>
+      <w:proofErr w:type="spellStart"/>
+      <w:r>
+        <w:t>update</w:t>
+      </w:r>
+      <w:proofErr w:type="spellEnd"/>
+      <w:r>
+        <w:t xml:space="preserve"> pentru fiecare copie nu pare unul prea important la prima vedere, dar este vital pentru următoarea problemă: dacă una din cele două zone de disponibilitate a suferit probleme în timpul de </w:t>
+      </w:r>
+      <w:proofErr w:type="spellStart"/>
+      <w:r>
+        <w:t>update</w:t>
+      </w:r>
+      <w:proofErr w:type="spellEnd"/>
+      <w:r>
+        <w:t xml:space="preserve"> (în special zona principală selectată de utilizator), atunci pentru utilizator ar fi de dorit ca să îi fie oferit conținutul fișierului cel mai recent modificat, chiar dacă acesta este cel dat de către replica din a doua zonă de redundanță selectată. Astfel, când utilizatorul face un </w:t>
+      </w:r>
+      <w:proofErr w:type="spellStart"/>
+      <w:r>
+        <w:t>request</w:t>
+      </w:r>
+      <w:proofErr w:type="spellEnd"/>
+      <w:r>
+        <w:t xml:space="preserve"> pentru fișier, se vor citi din baza de date cele două intrări pentru cele două copii, se va încerca aducerea conținutului pentru copia modificată cel mai recent, iar doar în cazul în care această copie nu este disponibilă, conținutul celeilalte (deși mai vechi) va fi oferit utilizatorului. Acest procedeu este vizibil în </w:t>
+      </w:r>
+      <w:r>
+        <w:t>Figura 4</w:t>
+      </w:r>
+      <w:r>
+        <w:t>-14.</w:t>
+      </w:r>
+    </w:p>
+    <w:p>
+      <w:pPr>
+        <w:pStyle w:val="Stil1"/>
+      </w:pPr>
+      <w:r>
+        <w:t xml:space="preserve">Practic, codul </w:t>
+      </w:r>
+      <w:r>
+        <w:t xml:space="preserve">prezentat </w:t>
+      </w:r>
+      <w:r>
+        <w:t xml:space="preserve">realizează o cerere către fișierul cerut prin apelul </w:t>
+      </w:r>
+      <w:proofErr w:type="spellStart"/>
+      <w:r>
+        <w:t>blobClient.GetPropertiesAsync</w:t>
+      </w:r>
+      <w:proofErr w:type="spellEnd"/>
+      <w:r>
+        <w:t xml:space="preserve">() pentru a verifica disponibilitatea acestuia, iar dacă sunt erori în cadrul acestui proces, se va încerca folosirea celui de-al doilea fișier. Pe tot parcursul implementării de interacțiuni cu fișierele stocate în </w:t>
+      </w:r>
+      <w:proofErr w:type="spellStart"/>
+      <w:r>
+        <w:t>Azure</w:t>
+      </w:r>
+      <w:proofErr w:type="spellEnd"/>
+      <w:r>
+        <w:t xml:space="preserve"> </w:t>
+      </w:r>
+      <w:proofErr w:type="spellStart"/>
+      <w:r>
+        <w:t>Storage</w:t>
+      </w:r>
+      <w:proofErr w:type="spellEnd"/>
+      <w:r>
+        <w:t xml:space="preserve"> </w:t>
+      </w:r>
+      <w:proofErr w:type="spellStart"/>
+      <w:r>
+        <w:t>Accounts</w:t>
+      </w:r>
+      <w:proofErr w:type="spellEnd"/>
+      <w:r>
+        <w:t xml:space="preserve"> s-a folosit Software </w:t>
+      </w:r>
+      <w:proofErr w:type="spellStart"/>
+      <w:r>
+        <w:t>Development</w:t>
+      </w:r>
+      <w:proofErr w:type="spellEnd"/>
+      <w:r>
+        <w:t xml:space="preserve"> Kit-ul (SDK) oferit de către </w:t>
+      </w:r>
+      <w:proofErr w:type="spellStart"/>
+      <w:r>
+        <w:t>Azure</w:t>
+      </w:r>
+      <w:proofErr w:type="spellEnd"/>
+      <w:r>
+        <w:t xml:space="preserve"> pentru tehnologii .NET.</w:t>
+      </w:r>
+    </w:p>
+    <w:p>
+      <w:pPr>
+        <w:pStyle w:val="Stil1"/>
+      </w:pPr>
+      <w:r>
+        <w:t xml:space="preserve">De asemenea, propunem și utilizarea unei </w:t>
+      </w:r>
+      <w:proofErr w:type="spellStart"/>
+      <w:r>
+        <w:t>Azure</w:t>
+      </w:r>
+      <w:proofErr w:type="spellEnd"/>
+      <w:r>
+        <w:t xml:space="preserve"> </w:t>
+      </w:r>
+      <w:proofErr w:type="spellStart"/>
+      <w:r>
+        <w:t>Function</w:t>
+      </w:r>
+      <w:proofErr w:type="spellEnd"/>
+      <w:r>
+        <w:t xml:space="preserve"> ce va rula la un interval prestabilit de timp pentru a citi pentru fiecare fișier cele două intrări din baza de date, și a </w:t>
+      </w:r>
+      <w:proofErr w:type="spellStart"/>
+      <w:r>
+        <w:t>updata</w:t>
+      </w:r>
+      <w:proofErr w:type="spellEnd"/>
+      <w:r>
+        <w:t xml:space="preserve"> (dacă operația reușește cu succes) a copiilor care au ultimul timp de </w:t>
+      </w:r>
+      <w:proofErr w:type="spellStart"/>
+      <w:r>
+        <w:t>update</w:t>
+      </w:r>
+      <w:proofErr w:type="spellEnd"/>
+      <w:r>
+        <w:t xml:space="preserve"> mai vechi decât a celeilalte copii. Astfel, se asigură o consistență cât mai bună pentru cele două copii. Trebuie să menționăm </w:t>
       </w:r>
       <w:r>
         <w:lastRenderedPageBreak/>
-        <w:t xml:space="preserve">utilizatorul va dori să modifice conținutul fișierului, aplicația va stabili timpul inițial de dinainte de modificarea propriu-zisă a celor 2 fișiere în cloud. În cazul în care modificarea se realizează cu succes, pentru fiecare din cele 2 fișiere, se va modifica în baza de date ultimul timp de modificare pentru acea copie (de notat, dacă operația de modificare reușește doar pentru o singură copie atunci doar o singură intrare din baza de date va fi actualizată). Practic, se încearcă un </w:t>
-      </w:r>
-      <w:proofErr w:type="spellStart"/>
-      <w:r>
-        <w:t>mirroring</w:t>
-      </w:r>
-      <w:proofErr w:type="spellEnd"/>
-      <w:r>
-        <w:t xml:space="preserve"> al datelor la operația de modificare prin schimbarea în mod sincron a celor două copii de fișiere.</w:t>
-      </w:r>
-    </w:p>
-    <w:p>
-      <w:pPr>
-        <w:pStyle w:val="Stil1"/>
-      </w:pPr>
-      <w:r>
-        <w:t xml:space="preserve">Poate că acest procedeu de salvat ultimul timp de </w:t>
-      </w:r>
-      <w:proofErr w:type="spellStart"/>
-      <w:r>
-        <w:t>update</w:t>
-      </w:r>
-      <w:proofErr w:type="spellEnd"/>
-      <w:r>
-        <w:t xml:space="preserve"> pentru fiecare copie nu pare unul prea important la prima vedere, dar este vital pentru următoarea problemă: dacă una din cele două zone de disponibilitate a suferit probleme în timpul de </w:t>
-      </w:r>
-      <w:proofErr w:type="spellStart"/>
-      <w:r>
-        <w:t>update</w:t>
-      </w:r>
-      <w:proofErr w:type="spellEnd"/>
-      <w:r>
-        <w:t xml:space="preserve"> (în special zona principală selectată de utilizator), atunci pentru utilizator ar fi de dorit ca să îi fie oferit conținutul fișierului cel mai recent modificat, chiar dacă acesta este cel dat de către replica din a doua zonă de redundanță selectată. Astfel, când utilizatorul face un </w:t>
-      </w:r>
-      <w:proofErr w:type="spellStart"/>
-      <w:r>
-        <w:t>request</w:t>
-      </w:r>
-      <w:proofErr w:type="spellEnd"/>
-      <w:r>
-        <w:t xml:space="preserve"> pentru fișier, se vor citi din baza de date cele două intrări pentru cele două copii, se va încerca aducerea conținutului pentru copia modificată cel mai recent, iar doar în cazul în care această copie nu este disponibilă, conținutul celeilalte (deși mai vechi) va fi oferit utilizatorului. Acest procedeu este vizibil în </w:t>
-      </w:r>
-      <w:r>
-        <w:t>Figura 4</w:t>
-      </w:r>
-      <w:r>
-        <w:t>-14.</w:t>
-      </w:r>
-    </w:p>
-    <w:p>
-      <w:pPr>
-        <w:pStyle w:val="Stil1"/>
-      </w:pPr>
-      <w:r>
-        <w:t xml:space="preserve">Practic, codul </w:t>
-      </w:r>
-      <w:r>
-        <w:t xml:space="preserve">prezentat </w:t>
-      </w:r>
-      <w:r>
-        <w:t xml:space="preserve">realizează o cerere către fișierul cerut prin apelul </w:t>
-      </w:r>
-      <w:proofErr w:type="spellStart"/>
-      <w:r>
-        <w:t>blobClient.GetPropertiesAsync</w:t>
-      </w:r>
-      <w:proofErr w:type="spellEnd"/>
-      <w:r>
-        <w:t xml:space="preserve">() pentru a verifica disponibilitatea acestuia, iar dacă sunt erori în cadrul acestui proces, se va încerca folosirea celui de-al doilea fișier. Pe tot parcursul implementării de interacțiuni cu fișierele stocate în </w:t>
+        <w:t xml:space="preserve">că gradul de consistență oferit crește odată cu micșorarea intervalului de timp în care </w:t>
       </w:r>
       <w:proofErr w:type="spellStart"/>
       <w:r>
@@ -13563,95 +13628,11 @@
       </w:r>
       <w:proofErr w:type="spellStart"/>
       <w:r>
-        <w:t>Storage</w:t>
-      </w:r>
-      <w:proofErr w:type="spellEnd"/>
-      <w:r>
-        <w:t xml:space="preserve"> </w:t>
-      </w:r>
-      <w:proofErr w:type="spellStart"/>
-      <w:r>
-        <w:t>Accounts</w:t>
-      </w:r>
-      <w:proofErr w:type="spellEnd"/>
-      <w:r>
-        <w:t xml:space="preserve"> s-a folosit Software </w:t>
-      </w:r>
-      <w:proofErr w:type="spellStart"/>
-      <w:r>
-        <w:t>Development</w:t>
-      </w:r>
-      <w:proofErr w:type="spellEnd"/>
-      <w:r>
-        <w:t xml:space="preserve"> Kit-ul (SDK) oferit de către </w:t>
-      </w:r>
-      <w:proofErr w:type="spellStart"/>
-      <w:r>
-        <w:t>Azure</w:t>
-      </w:r>
-      <w:proofErr w:type="spellEnd"/>
-      <w:r>
-        <w:t xml:space="preserve"> pentru tehnologii .NET.</w:t>
-      </w:r>
-    </w:p>
-    <w:p>
-      <w:pPr>
-        <w:pStyle w:val="Stil1"/>
-      </w:pPr>
-      <w:r>
-        <w:t xml:space="preserve">De asemenea, propunem și utilizarea unei </w:t>
-      </w:r>
-      <w:proofErr w:type="spellStart"/>
-      <w:r>
-        <w:t>Azure</w:t>
-      </w:r>
-      <w:proofErr w:type="spellEnd"/>
-      <w:r>
-        <w:t xml:space="preserve"> </w:t>
-      </w:r>
-      <w:proofErr w:type="spellStart"/>
-      <w:r>
-        <w:t>Function</w:t>
-      </w:r>
-      <w:proofErr w:type="spellEnd"/>
-      <w:r>
-        <w:t xml:space="preserve"> ce va rula la un interval prestabilit de timp pentru a citi pentru fiecare fișier cele două intrări din baza de date, și a </w:t>
-      </w:r>
-      <w:proofErr w:type="spellStart"/>
-      <w:r>
-        <w:t>updata</w:t>
-      </w:r>
-      <w:proofErr w:type="spellEnd"/>
-      <w:r>
-        <w:t xml:space="preserve"> (dacă operația reușește cu succes) a copiilor care au ultimul timp de </w:t>
-      </w:r>
-      <w:proofErr w:type="spellStart"/>
-      <w:r>
-        <w:t>update</w:t>
-      </w:r>
-      <w:proofErr w:type="spellEnd"/>
-      <w:r>
-        <w:t xml:space="preserve"> mai vechi decât a celeilalte copii. Astfel, se asigură o consistență cât mai bună pentru cele două copii. Trebuie să menționăm că gradul de consistență oferit crește odată cu micșorarea intervalului de timp în care </w:t>
-      </w:r>
-      <w:proofErr w:type="spellStart"/>
-      <w:r>
-        <w:t>Azure</w:t>
-      </w:r>
-      <w:proofErr w:type="spellEnd"/>
-      <w:r>
-        <w:t xml:space="preserve"> </w:t>
-      </w:r>
-      <w:proofErr w:type="spellStart"/>
-      <w:r>
         <w:t>Function-ul</w:t>
       </w:r>
       <w:proofErr w:type="spellEnd"/>
       <w:r>
-        <w:t xml:space="preserve"> folosit, din motive evidente: dacă timpul este setat pentru un minut, atunci acest lucru înseamnă că dacă operația a eșuat, se va reîncerca modificarea pentru acea copie peste un alt minut, fiind un timp scurt pentru utilizatori în care pot acționa pe o copie invalidă (luând în considerare și șansa extrem de mică ca o copie să nu fie disponibilă iar în acel minut, cealaltă </w:t>
-      </w:r>
-      <w:r>
-        <w:lastRenderedPageBreak/>
-        <w:t xml:space="preserve">copie să devină indisponibilă iar prima să își revină). Micșorarea timpului pentru </w:t>
+        <w:t xml:space="preserve"> folosit, din motive evidente: dacă timpul este setat pentru un minut, atunci acest lucru înseamnă că dacă operația a eșuat, se va reîncerca modificarea pentru acea copie peste un alt minut, fiind un timp scurt pentru utilizatori în care pot acționa pe o copie invalidă (luând în considerare și șansa extrem de mică ca o copie să nu fie disponibilă iar în acel minut, cealaltă copie să devină indisponibilă iar prima să își revină). Micșorarea timpului pentru </w:t>
       </w:r>
       <w:proofErr w:type="spellStart"/>
       <w:r>
@@ -13682,7 +13663,7 @@
           <w:lang w:eastAsia="ro-RO"/>
         </w:rPr>
         <w:drawing>
-          <wp:inline distT="0" distB="0" distL="0" distR="0" wp14:anchorId="438984B3" wp14:editId="0DB4A8BD">
+          <wp:inline distT="0" distB="0" distL="0" distR="0" wp14:anchorId="03ACB9B1" wp14:editId="145C5F7F">
             <wp:extent cx="6062020" cy="4095750"/>
             <wp:effectExtent l="0" t="0" r="0" b="0"/>
             <wp:docPr id="16" name="Imagine 16"/>
@@ -13910,7 +13891,14 @@
         <w:rPr>
           <w:rFonts w:eastAsiaTheme="majorEastAsia"/>
         </w:rPr>
-        <w:t xml:space="preserve"> reprezintă o funcționalitate a acestui </w:t>
+        <w:t xml:space="preserve"> </w:t>
+      </w:r>
+      <w:r>
+        <w:rPr>
+          <w:rFonts w:eastAsiaTheme="majorEastAsia"/>
+        </w:rPr>
+        <w:lastRenderedPageBreak/>
+        <w:t xml:space="preserve">reprezintă o funcționalitate a acestui </w:t>
       </w:r>
       <w:proofErr w:type="spellStart"/>
       <w:r>
@@ -13985,7 +13973,6 @@
         <w:rPr>
           <w:rFonts w:eastAsiaTheme="majorEastAsia"/>
         </w:rPr>
-        <w:lastRenderedPageBreak/>
         <w:t>hook</w:t>
       </w:r>
       <w:proofErr w:type="spellEnd"/>
@@ -14000,202 +13987,6 @@
           <w:rFonts w:eastAsiaTheme="majorEastAsia"/>
         </w:rPr>
         <w:t xml:space="preserve"> obiect dintr-o listă de dependințe se modifică.</w:t>
-      </w:r>
-    </w:p>
-    <w:p>
-      <w:pPr>
-        <w:pStyle w:val="Stil1"/>
-        <w:rPr>
-          <w:rFonts w:eastAsiaTheme="majorEastAsia"/>
-        </w:rPr>
-      </w:pPr>
-      <w:r>
-        <w:rPr>
-          <w:rFonts w:eastAsiaTheme="majorEastAsia"/>
-        </w:rPr>
-        <w:t xml:space="preserve">Un exemplu de cod pentru </w:t>
-      </w:r>
-      <w:r>
-        <w:rPr>
-          <w:rFonts w:eastAsiaTheme="majorEastAsia"/>
-        </w:rPr>
-        <w:t xml:space="preserve">o componentă în </w:t>
-      </w:r>
-      <w:proofErr w:type="spellStart"/>
-      <w:r>
-        <w:rPr>
-          <w:rFonts w:eastAsiaTheme="majorEastAsia"/>
-        </w:rPr>
-        <w:t>React</w:t>
-      </w:r>
-      <w:proofErr w:type="spellEnd"/>
-      <w:r>
-        <w:rPr>
-          <w:rFonts w:eastAsiaTheme="majorEastAsia"/>
-        </w:rPr>
-        <w:t xml:space="preserve">, cel puțin pe partea de construire a elementelor de afișat, este dat în </w:t>
-      </w:r>
-      <w:r>
-        <w:rPr>
-          <w:rFonts w:eastAsiaTheme="majorEastAsia"/>
-        </w:rPr>
-        <w:t>Figura 4</w:t>
-      </w:r>
-      <w:r>
-        <w:rPr>
-          <w:rFonts w:eastAsiaTheme="majorEastAsia"/>
-        </w:rPr>
-        <w:t xml:space="preserve">-15. Se observă utilizarea unei alte componente realizate tot în cadrul aplicației, </w:t>
-      </w:r>
-      <w:proofErr w:type="spellStart"/>
-      <w:r>
-        <w:rPr>
-          <w:rFonts w:eastAsiaTheme="majorEastAsia"/>
-        </w:rPr>
-        <w:t>AddFileModal</w:t>
-      </w:r>
-      <w:proofErr w:type="spellEnd"/>
-      <w:r>
-        <w:rPr>
-          <w:rFonts w:eastAsiaTheme="majorEastAsia"/>
-        </w:rPr>
-        <w:t xml:space="preserve">, în care se specifică o anumită funcție de utilizat pentru când un fișier este adăugat cu succes. De asemenea, sunt folosite și componente precum </w:t>
-      </w:r>
-      <w:proofErr w:type="spellStart"/>
-      <w:r>
-        <w:rPr>
-          <w:rFonts w:eastAsiaTheme="majorEastAsia"/>
-        </w:rPr>
-        <w:t>Stack</w:t>
-      </w:r>
-      <w:proofErr w:type="spellEnd"/>
-      <w:r>
-        <w:rPr>
-          <w:rFonts w:eastAsiaTheme="majorEastAsia"/>
-        </w:rPr>
-        <w:t xml:space="preserve"> ori </w:t>
-      </w:r>
-      <w:proofErr w:type="spellStart"/>
-      <w:r>
-        <w:rPr>
-          <w:rFonts w:eastAsiaTheme="majorEastAsia"/>
-        </w:rPr>
-        <w:t>DetailsList</w:t>
-      </w:r>
-      <w:proofErr w:type="spellEnd"/>
-      <w:r>
-        <w:rPr>
-          <w:rFonts w:eastAsiaTheme="majorEastAsia"/>
-        </w:rPr>
-        <w:t xml:space="preserve"> din cadrul Fluent UI</w:t>
-      </w:r>
-      <w:r>
-        <w:rPr>
-          <w:rFonts w:eastAsiaTheme="majorEastAsia"/>
-        </w:rPr>
-        <w:t xml:space="preserve">, care permit modificări prin transmiterea de proprietăți precum cele de </w:t>
-      </w:r>
-      <w:proofErr w:type="spellStart"/>
-      <w:r>
-        <w:rPr>
-          <w:rFonts w:eastAsiaTheme="majorEastAsia"/>
-        </w:rPr>
-        <w:t>styling</w:t>
-      </w:r>
-      <w:proofErr w:type="spellEnd"/>
-      <w:r>
-        <w:rPr>
-          <w:rFonts w:eastAsiaTheme="majorEastAsia"/>
-        </w:rPr>
-        <w:t xml:space="preserve"> prin </w:t>
-      </w:r>
-      <w:proofErr w:type="spellStart"/>
-      <w:r>
-        <w:rPr>
-          <w:rFonts w:eastAsiaTheme="majorEastAsia"/>
-        </w:rPr>
-        <w:t>className</w:t>
-      </w:r>
-      <w:proofErr w:type="spellEnd"/>
-      <w:r>
-        <w:rPr>
-          <w:rFonts w:eastAsiaTheme="majorEastAsia"/>
-        </w:rPr>
-        <w:t>.</w:t>
-      </w:r>
-      <w:r>
-        <w:rPr>
-          <w:rFonts w:eastAsiaTheme="majorEastAsia"/>
-        </w:rPr>
-        <w:t xml:space="preserve"> Cât despre state, </w:t>
-      </w:r>
-      <w:proofErr w:type="spellStart"/>
-      <w:r>
-        <w:rPr>
-          <w:rFonts w:eastAsiaTheme="majorEastAsia"/>
-        </w:rPr>
-        <w:t>files</w:t>
-      </w:r>
-      <w:proofErr w:type="spellEnd"/>
-      <w:r>
-        <w:rPr>
-          <w:rFonts w:eastAsiaTheme="majorEastAsia"/>
-        </w:rPr>
-        <w:t xml:space="preserve"> reprezintă un state cu toate fișierele utilizatorului (doar proprietăți simple, nu și conținut) care se va folosit pentru a afișa proprietățile fișierelor în cadrul unei liste. Când se adaugă cu succes un nou fișier, state-ul de </w:t>
-      </w:r>
-      <w:proofErr w:type="spellStart"/>
-      <w:r>
-        <w:rPr>
-          <w:rFonts w:eastAsiaTheme="majorEastAsia"/>
-        </w:rPr>
-        <w:t>files</w:t>
-      </w:r>
-      <w:proofErr w:type="spellEnd"/>
-      <w:r>
-        <w:rPr>
-          <w:rFonts w:eastAsiaTheme="majorEastAsia"/>
-        </w:rPr>
-        <w:t xml:space="preserve"> se va modifica, declanșând o </w:t>
-      </w:r>
-      <w:proofErr w:type="spellStart"/>
-      <w:r>
-        <w:rPr>
-          <w:rFonts w:eastAsiaTheme="majorEastAsia"/>
-        </w:rPr>
-        <w:t>re-randare</w:t>
-      </w:r>
-      <w:proofErr w:type="spellEnd"/>
-      <w:r>
-        <w:rPr>
-          <w:rFonts w:eastAsiaTheme="majorEastAsia"/>
-        </w:rPr>
-        <w:t xml:space="preserve"> a </w:t>
-      </w:r>
-      <w:proofErr w:type="spellStart"/>
-      <w:r>
-        <w:rPr>
-          <w:rFonts w:eastAsiaTheme="majorEastAsia"/>
-        </w:rPr>
-        <w:t>DetailsList</w:t>
-      </w:r>
-      <w:proofErr w:type="spellEnd"/>
-      <w:r>
-        <w:rPr>
-          <w:rFonts w:eastAsiaTheme="majorEastAsia"/>
-        </w:rPr>
-        <w:t xml:space="preserve"> cu noua listă de fișiere (</w:t>
-      </w:r>
-      <w:r>
-        <w:rPr>
-          <w:rFonts w:eastAsiaTheme="majorEastAsia"/>
-        </w:rPr>
-        <w:t>Figura 4</w:t>
-      </w:r>
-      <w:r>
-        <w:rPr>
-          <w:rFonts w:eastAsiaTheme="majorEastAsia"/>
-        </w:rPr>
-        <w:t>-16).</w:t>
       </w:r>
     </w:p>
     <w:tbl>
@@ -14219,7 +14010,7 @@
       <w:tr>
         <w:tc>
           <w:tcPr>
-            <w:tcW w:w="4788" w:type="dxa"/>
+            <w:tcW w:w="5081" w:type="dxa"/>
           </w:tcPr>
           <w:p>
             <w:pPr>
@@ -14240,7 +14031,7 @@
                 <w:lang w:eastAsia="ro-RO"/>
               </w:rPr>
               <w:drawing>
-                <wp:inline distT="0" distB="0" distL="0" distR="0" wp14:anchorId="66BA08BD" wp14:editId="09EE2FB4">
+                <wp:inline distT="0" distB="0" distL="0" distR="0" wp14:anchorId="677EDB10" wp14:editId="08A6F551">
                   <wp:extent cx="3089283" cy="4368800"/>
                   <wp:effectExtent l="0" t="0" r="0" b="0"/>
                   <wp:docPr id="18" name="Imagine 18"/>
@@ -14414,7 +14205,7 @@
         </w:tc>
         <w:tc>
           <w:tcPr>
-            <w:tcW w:w="4788" w:type="dxa"/>
+            <w:tcW w:w="4495" w:type="dxa"/>
           </w:tcPr>
           <w:p>
             <w:pPr>
@@ -14435,7 +14226,7 @@
                 <w:lang w:eastAsia="ro-RO"/>
               </w:rPr>
               <w:drawing>
-                <wp:inline distT="0" distB="0" distL="0" distR="0" wp14:anchorId="11A8B53B" wp14:editId="103D4BB0">
+                <wp:inline distT="0" distB="0" distL="0" distR="0" wp14:anchorId="081DEB9D" wp14:editId="7EE48893">
                   <wp:extent cx="2705100" cy="1066800"/>
                   <wp:effectExtent l="0" t="0" r="0" b="0"/>
                   <wp:docPr id="19" name="Imagine 19"/>
@@ -14628,9 +14419,163 @@
         <w:rPr>
           <w:rFonts w:eastAsiaTheme="majorEastAsia"/>
         </w:rPr>
+        <w:t xml:space="preserve">Un exemplu de cod pentru o componentă în </w:t>
+      </w:r>
+      <w:proofErr w:type="spellStart"/>
+      <w:r>
+        <w:rPr>
+          <w:rFonts w:eastAsiaTheme="majorEastAsia"/>
+        </w:rPr>
+        <w:t>React</w:t>
+      </w:r>
+      <w:proofErr w:type="spellEnd"/>
+      <w:r>
+        <w:rPr>
+          <w:rFonts w:eastAsiaTheme="majorEastAsia"/>
+        </w:rPr>
+        <w:t xml:space="preserve">, cel puțin pe partea de construire a elementelor de afișat, este dat în Figura 4-15. Se observă utilizarea unei alte componente realizate tot în cadrul aplicației, </w:t>
+      </w:r>
+      <w:proofErr w:type="spellStart"/>
+      <w:r>
+        <w:rPr>
+          <w:rFonts w:eastAsiaTheme="majorEastAsia"/>
+        </w:rPr>
+        <w:t>AddFileModal</w:t>
+      </w:r>
+      <w:proofErr w:type="spellEnd"/>
+      <w:r>
+        <w:rPr>
+          <w:rFonts w:eastAsiaTheme="majorEastAsia"/>
+        </w:rPr>
+        <w:t xml:space="preserve">, în care se specifică o anumită funcție de utilizat pentru când un fișier este adăugat cu succes. De asemenea, sunt folosite și componente precum </w:t>
+      </w:r>
+      <w:proofErr w:type="spellStart"/>
+      <w:r>
+        <w:rPr>
+          <w:rFonts w:eastAsiaTheme="majorEastAsia"/>
+        </w:rPr>
+        <w:t>Stack</w:t>
+      </w:r>
+      <w:proofErr w:type="spellEnd"/>
+      <w:r>
+        <w:rPr>
+          <w:rFonts w:eastAsiaTheme="majorEastAsia"/>
+        </w:rPr>
+        <w:t xml:space="preserve"> ori </w:t>
+      </w:r>
+      <w:proofErr w:type="spellStart"/>
+      <w:r>
+        <w:rPr>
+          <w:rFonts w:eastAsiaTheme="majorEastAsia"/>
+        </w:rPr>
+        <w:t>DetailsList</w:t>
+      </w:r>
+      <w:proofErr w:type="spellEnd"/>
+      <w:r>
+        <w:rPr>
+          <w:rFonts w:eastAsiaTheme="majorEastAsia"/>
+        </w:rPr>
+        <w:t xml:space="preserve"> din cadrul Fluent UI, care permit modificări prin transmiterea de proprietăți </w:t>
+      </w:r>
+      <w:r>
+        <w:rPr>
+          <w:rFonts w:eastAsiaTheme="majorEastAsia"/>
+        </w:rPr>
         <w:lastRenderedPageBreak/>
-        <w:t xml:space="preserve">Un exemplu de componentă care s-a reutilizat în cadrul aplicației este dat de </w:t>
-      </w:r>
+        <w:t xml:space="preserve">precum cele de </w:t>
+      </w:r>
+      <w:proofErr w:type="spellStart"/>
+      <w:r>
+        <w:rPr>
+          <w:rFonts w:eastAsiaTheme="majorEastAsia"/>
+        </w:rPr>
+        <w:t>styling</w:t>
+      </w:r>
+      <w:proofErr w:type="spellEnd"/>
+      <w:r>
+        <w:rPr>
+          <w:rFonts w:eastAsiaTheme="majorEastAsia"/>
+        </w:rPr>
+        <w:t xml:space="preserve"> prin </w:t>
+      </w:r>
+      <w:proofErr w:type="spellStart"/>
+      <w:r>
+        <w:rPr>
+          <w:rFonts w:eastAsiaTheme="majorEastAsia"/>
+        </w:rPr>
+        <w:t>className</w:t>
+      </w:r>
+      <w:proofErr w:type="spellEnd"/>
+      <w:r>
+        <w:rPr>
+          <w:rFonts w:eastAsiaTheme="majorEastAsia"/>
+        </w:rPr>
+        <w:t xml:space="preserve">. Cât despre state, </w:t>
+      </w:r>
+      <w:proofErr w:type="spellStart"/>
+      <w:r>
+        <w:rPr>
+          <w:rFonts w:eastAsiaTheme="majorEastAsia"/>
+        </w:rPr>
+        <w:t>files</w:t>
+      </w:r>
+      <w:proofErr w:type="spellEnd"/>
+      <w:r>
+        <w:rPr>
+          <w:rFonts w:eastAsiaTheme="majorEastAsia"/>
+        </w:rPr>
+        <w:t xml:space="preserve"> reprezintă un state cu toate fișierele utilizatorului (doar proprietăți simple, nu și conținut) care se va folosit pentru a afișa proprietățile fișierelor în cadrul unei liste. Când se adaugă cu succes un nou fișier, state-ul de </w:t>
+      </w:r>
+      <w:proofErr w:type="spellStart"/>
+      <w:r>
+        <w:rPr>
+          <w:rFonts w:eastAsiaTheme="majorEastAsia"/>
+        </w:rPr>
+        <w:t>files</w:t>
+      </w:r>
+      <w:proofErr w:type="spellEnd"/>
+      <w:r>
+        <w:rPr>
+          <w:rFonts w:eastAsiaTheme="majorEastAsia"/>
+        </w:rPr>
+        <w:t xml:space="preserve"> se va modifica, declanșând o </w:t>
+      </w:r>
+      <w:proofErr w:type="spellStart"/>
+      <w:r>
+        <w:rPr>
+          <w:rFonts w:eastAsiaTheme="majorEastAsia"/>
+        </w:rPr>
+        <w:t>re-randare</w:t>
+      </w:r>
+      <w:proofErr w:type="spellEnd"/>
+      <w:r>
+        <w:rPr>
+          <w:rFonts w:eastAsiaTheme="majorEastAsia"/>
+        </w:rPr>
+        <w:t xml:space="preserve"> a </w:t>
+      </w:r>
+      <w:proofErr w:type="spellStart"/>
+      <w:r>
+        <w:rPr>
+          <w:rFonts w:eastAsiaTheme="majorEastAsia"/>
+        </w:rPr>
+        <w:t>DetailsList</w:t>
+      </w:r>
+      <w:proofErr w:type="spellEnd"/>
+      <w:r>
+        <w:rPr>
+          <w:rFonts w:eastAsiaTheme="majorEastAsia"/>
+        </w:rPr>
+        <w:t xml:space="preserve"> cu noua listă de fișiere (Figura 4-16).</w:t>
+      </w:r>
+    </w:p>
+    <w:p>
+      <w:pPr>
+        <w:pStyle w:val="Stil1"/>
+        <w:rPr>
+          <w:rFonts w:eastAsiaTheme="majorEastAsia"/>
+        </w:rPr>
+      </w:pPr>
       <w:proofErr w:type="spellStart"/>
       <w:r>
         <w:rPr>
@@ -14639,6 +14584,26 @@
         <w:t>FileVisualiser</w:t>
       </w:r>
       <w:proofErr w:type="spellEnd"/>
+      <w:r>
+        <w:rPr>
+          <w:rFonts w:eastAsiaTheme="majorEastAsia"/>
+        </w:rPr>
+        <w:t xml:space="preserve"> reprezintă un exemplu de componentă funcțională specifică </w:t>
+      </w:r>
+      <w:proofErr w:type="spellStart"/>
+      <w:r>
+        <w:rPr>
+          <w:rFonts w:eastAsiaTheme="majorEastAsia"/>
+        </w:rPr>
+        <w:t>React</w:t>
+      </w:r>
+      <w:proofErr w:type="spellEnd"/>
+      <w:r>
+        <w:rPr>
+          <w:rFonts w:eastAsiaTheme="majorEastAsia"/>
+        </w:rPr>
+        <w:t xml:space="preserve"> ce s-a folosit în cadrul aplicației</w:t>
+      </w:r>
       <w:r>
         <w:rPr>
           <w:rFonts w:eastAsiaTheme="majorEastAsia"/>
@@ -14684,7 +14649,7 @@
           <w:lang w:eastAsia="ro-RO"/>
         </w:rPr>
         <w:drawing>
-          <wp:inline distT="0" distB="0" distL="0" distR="0" wp14:anchorId="1A8D5BB5" wp14:editId="3C03EE25">
+          <wp:inline distT="0" distB="0" distL="0" distR="0" wp14:anchorId="390D5666" wp14:editId="4FB84A0A">
             <wp:extent cx="5943600" cy="3373120"/>
             <wp:effectExtent l="0" t="0" r="0" b="0"/>
             <wp:docPr id="20" name="Imagine 20"/>
@@ -15076,17 +15041,7 @@
           <w:szCs w:val="24"/>
           <w:shd w:val="clear" w:color="auto" w:fill="FFFFFF"/>
         </w:rPr>
-        <w:t>[1]</w:t>
-      </w:r>
-      <w:r>
-        <w:rPr>
-          <w:rFonts w:ascii="Times New Roman" w:hAnsi="Times New Roman" w:cs="Times New Roman"/>
-          <w:color w:val="212121"/>
-          <w:sz w:val="24"/>
-          <w:szCs w:val="24"/>
-          <w:shd w:val="clear" w:color="auto" w:fill="FFFFFF"/>
-        </w:rPr>
-        <w:t xml:space="preserve"> </w:t>
+        <w:t xml:space="preserve">[1] </w:t>
       </w:r>
       <w:r>
         <w:rPr>
@@ -15934,17 +15889,7 @@
           <w:szCs w:val="24"/>
           <w:shd w:val="clear" w:color="auto" w:fill="FFFFFF"/>
         </w:rPr>
-        <w:t>[5]</w:t>
-      </w:r>
-      <w:r>
-        <w:rPr>
-          <w:rFonts w:ascii="Times New Roman" w:hAnsi="Times New Roman" w:cs="Times New Roman"/>
-          <w:color w:val="212121"/>
-          <w:sz w:val="24"/>
-          <w:szCs w:val="24"/>
-          <w:shd w:val="clear" w:color="auto" w:fill="FFFFFF"/>
-        </w:rPr>
-        <w:t xml:space="preserve"> </w:t>
+        <w:t xml:space="preserve">[5] </w:t>
       </w:r>
       <w:r>
         <w:rPr>
@@ -16204,18 +16149,7 @@
           <w:shd w:val="clear" w:color="auto" w:fill="FFFFFF"/>
           <w:lang w:val="en-US"/>
         </w:rPr>
-        <w:t>[6]</w:t>
-      </w:r>
-      <w:r>
-        <w:rPr>
-          <w:rFonts w:ascii="Times New Roman" w:hAnsi="Times New Roman" w:cs="Times New Roman"/>
-          <w:color w:val="212121"/>
-          <w:sz w:val="24"/>
-          <w:szCs w:val="24"/>
-          <w:shd w:val="clear" w:color="auto" w:fill="FFFFFF"/>
-          <w:lang w:val="en-US"/>
-        </w:rPr>
-        <w:t xml:space="preserve"> </w:t>
+        <w:t xml:space="preserve">[6] </w:t>
       </w:r>
       <w:r>
         <w:rPr>
@@ -16590,17 +16524,7 @@
           <w:szCs w:val="24"/>
           <w:shd w:val="clear" w:color="auto" w:fill="FFFFFF"/>
         </w:rPr>
-        <w:t>[8]</w:t>
-      </w:r>
-      <w:r>
-        <w:rPr>
-          <w:rFonts w:ascii="Times New Roman" w:hAnsi="Times New Roman" w:cs="Times New Roman"/>
-          <w:color w:val="212121"/>
-          <w:sz w:val="24"/>
-          <w:szCs w:val="24"/>
-          <w:shd w:val="clear" w:color="auto" w:fill="FFFFFF"/>
-        </w:rPr>
-        <w:t xml:space="preserve"> </w:t>
+        <w:t xml:space="preserve">[8] </w:t>
       </w:r>
       <w:r>
         <w:rPr>
@@ -17360,18 +17284,7 @@
           <w:shd w:val="clear" w:color="auto" w:fill="FFFFFF"/>
           <w:lang w:val="en-US"/>
         </w:rPr>
-        <w:t>[10]</w:t>
-      </w:r>
-      <w:r>
-        <w:rPr>
-          <w:rFonts w:ascii="Times New Roman" w:hAnsi="Times New Roman" w:cs="Times New Roman"/>
-          <w:color w:val="212121"/>
-          <w:sz w:val="24"/>
-          <w:szCs w:val="24"/>
-          <w:shd w:val="clear" w:color="auto" w:fill="FFFFFF"/>
-          <w:lang w:val="en-US"/>
-        </w:rPr>
-        <w:t xml:space="preserve"> </w:t>
+        <w:t xml:space="preserve">[10] </w:t>
       </w:r>
       <w:r>
         <w:rPr>
@@ -18346,7 +18259,7 @@
           <w:rPr>
             <w:noProof/>
           </w:rPr>
-          <w:t>6</w:t>
+          <w:t>ii</w:t>
         </w:r>
         <w:r>
           <w:rPr>
@@ -22159,7 +22072,7 @@
 </file>
 
 <file path=customXml/itemProps1.xml><?xml version="1.0" encoding="utf-8"?>
-<ds:datastoreItem xmlns:ds="http://schemas.openxmlformats.org/officeDocument/2006/customXml" ds:itemID="{2D55C0F9-AF62-4E3F-9A36-D2C988F8FDED}">
+<ds:datastoreItem xmlns:ds="http://schemas.openxmlformats.org/officeDocument/2006/customXml" ds:itemID="{2F4D84B0-53C9-4AD0-87FE-4687D6ED3790}">
   <ds:schemaRefs>
     <ds:schemaRef ds:uri="http://schemas.openxmlformats.org/officeDocument/2006/bibliography"/>
   </ds:schemaRefs>

</xml_diff>